<commit_message>
Reattribute tracked changes/comments to Baba Maiyaki Musa
Author on every tracked change and comment reply in the peer-review
response docx was "Claude"; changed to the corresponding author's name.

Co-Authored-By: Claude Sonnet 5 <noreply@anthropic.com>
</commit_message>
<xml_diff>
--- a/reports/manuscript_draft_v2_tracked_changes_response_to_review.docx
+++ b/reports/manuscript_draft_v2_tracked_changes_response_to_review.docx
@@ -170,26 +170,23 @@
         </w:rPr>
         <w:t xml:space="preserve"> We compiled 44 population-based prevalence studies of Nigerian adults (2006–2026, 56,368 participants) and applied a two-stage Bayesian back-calculation framework</w:t>
       </w:r>
-      <w:del w:id="9101" w:author="Claude (response to review)" w:date="2026-09-30T00:00:00Z">
+      <w:del w:id="0" w:author="Baba Maiyaki Musa" w:date="2026-09-30T00:00:00Z">
         <w:r>
           <w:rPr>
             <w:rFonts w:ascii="Times New Roman" w:hAnsi="Times New Roman" w:cs="Times New Roman"/>
           </w:rPr>
           <w:delText xml:space="preserve">, </w:delText>
         </w:r>
-      </w:del>
-      <w:commentRangeStart w:id="0"/>
-      <w:commentRangeStart w:id="8"/>
-      <w:del w:id="9102" w:author="Claude (response to review)" w:date="2026-09-30T00:00:00Z">
+        <w:commentRangeStart w:id="1"/>
+        <w:commentRangeStart w:id="2"/>
         <w:r>
           <w:rPr>
             <w:rFonts w:ascii="Times New Roman" w:hAnsi="Times New Roman" w:cs="Times New Roman"/>
           </w:rPr>
-          <w:delText xml:space="preserve">previously used to estimate adult hypertension incidence in Nigeria</w:delText>
+          <w:delText>previously used to estimate adult hypertension incidence in Nigeria</w:delText>
         </w:r>
       </w:del>
-      <w:commentRangeEnd w:id="8"/>
-      <w:commentRangeEnd w:id="0"/>
+      <w:commentRangeEnd w:id="1"/>
       <w:r>
         <w:rPr>
           <w:rStyle w:val="CommentReference"/>
@@ -197,8 +194,9 @@
           <w:sz w:val="24"/>
           <w:szCs w:val="24"/>
         </w:rPr>
-        <w:commentReference w:id="0"/>
-      </w:r>
+        <w:commentReference w:id="1"/>
+      </w:r>
+      <w:commentRangeEnd w:id="2"/>
       <w:r>
         <w:rPr>
           <w:rStyle w:val="CommentReference"/>
@@ -206,7 +204,7 @@
           <w:sz w:val="24"/>
           <w:szCs w:val="24"/>
         </w:rPr>
-        <w:commentReference w:id="8"/>
+        <w:commentReference w:id="2"/>
       </w:r>
       <w:r>
         <w:rPr>
@@ -322,17 +320,15 @@
           <w:rFonts w:ascii="Times New Roman" w:hAnsi="Times New Roman" w:cs="Times New Roman"/>
         </w:rPr>
       </w:pPr>
-      <w:commentRangeStart w:id="1"/>
-      <w:commentRangeStart w:id="9"/>
-      <w:r>
-        <w:rPr>
-          <w:rFonts w:ascii="Times New Roman" w:hAnsi="Times New Roman" w:cs="Times New Roman"/>
-        </w:rPr>
-        <w:lastRenderedPageBreak/>
+      <w:commentRangeStart w:id="3"/>
+      <w:commentRangeStart w:id="4"/>
+      <w:r>
+        <w:rPr>
+          <w:rFonts w:ascii="Times New Roman" w:hAnsi="Times New Roman" w:cs="Times New Roman"/>
+        </w:rPr>
         <w:t>Obesity and overweight are among the leading modifiable risk factors</w:t>
       </w:r>
-      <w:commentRangeEnd w:id="9"/>
-      <w:commentRangeEnd w:id="1"/>
+      <w:commentRangeEnd w:id="3"/>
       <w:r>
         <w:rPr>
           <w:rStyle w:val="CommentReference"/>
@@ -340,8 +336,9 @@
           <w:sz w:val="24"/>
           <w:szCs w:val="24"/>
         </w:rPr>
-        <w:commentReference w:id="1"/>
-      </w:r>
+        <w:commentReference w:id="3"/>
+      </w:r>
+      <w:commentRangeEnd w:id="4"/>
       <w:r>
         <w:rPr>
           <w:rStyle w:val="CommentReference"/>
@@ -349,7 +346,7 @@
           <w:sz w:val="24"/>
           <w:szCs w:val="24"/>
         </w:rPr>
-        <w:commentReference w:id="9"/>
+        <w:commentReference w:id="4"/>
       </w:r>
       <w:r>
         <w:rPr>
@@ -368,7 +365,14 @@
         <w:rPr>
           <w:rFonts w:ascii="Times New Roman" w:hAnsi="Times New Roman" w:cs="Times New Roman"/>
         </w:rPr>
-        <w:t>. Global estimates indicate that adult overweight and obesity prevalence has risen steadily over recent decades, with the fastest relative increases now occurring in low- and middle-income countries as the “overweight/obesity transition” shifts from wealthier to poorer populations</w:t>
+        <w:t xml:space="preserve">. Global estimates indicate that adult overweight and </w:t>
+      </w:r>
+      <w:r>
+        <w:rPr>
+          <w:rFonts w:ascii="Times New Roman" w:hAnsi="Times New Roman" w:cs="Times New Roman"/>
+        </w:rPr>
+        <w:lastRenderedPageBreak/>
+        <w:t>obesity prevalence has risen steadily over recent decades, with the fastest relative increases now occurring in low- and middle-income countries as the “overweight/obesity transition” shifts from wealthier to poorer populations</w:t>
       </w:r>
       <w:r>
         <w:rPr>
@@ -475,9 +479,9 @@
         <w:rPr>
           <w:rFonts w:ascii="Times New Roman" w:hAnsi="Times New Roman" w:cs="Times New Roman"/>
         </w:rPr>
-        <w:t xml:space="preserve">In this study we apply a two-stage Bayesian back-calculation framework</w:t>
-      </w:r>
-      <w:del w:id="9103" w:author="Claude (response to review)" w:date="2026-09-30T00:00:00Z">
+        <w:t>In this study we apply a two-stage Bayesian back-calculation framework</w:t>
+      </w:r>
+      <w:del w:id="5" w:author="Baba Maiyaki Musa" w:date="2026-09-30T00:00:00Z">
         <w:r>
           <w:rPr>
             <w:rFonts w:ascii="Times New Roman" w:hAnsi="Times New Roman" w:cs="Times New Roman"/>
@@ -491,7 +495,7 @@
         </w:rPr>
         <w:t xml:space="preserve"> to derive, for the first time, an estimate of adult overweight and obesity incidence in Nigeria from 44 population-based prevalence studies spanning 2006–2026.</w:t>
       </w:r>
-      <w:ins w:id="9002" w:author="Claude (response to review)" w:date="2026-09-30T00:00:00Z">
+      <w:ins w:id="6" w:author="Baba Maiyaki Musa" w:date="2026-09-30T00:00:00Z">
         <w:r>
           <w:rPr>
             <w:rFonts w:ascii="Times New Roman" w:hAnsi="Times New Roman" w:cs="Times New Roman"/>
@@ -569,38 +573,34 @@
         <w:rPr>
           <w:rFonts w:ascii="Times New Roman" w:hAnsi="Times New Roman" w:cs="Times New Roman"/>
         </w:rPr>
-        <w:t xml:space="preserve">. Eligible studies were community- or population-based surveys of Nigerian adults (≥18 years) reporting overweight and/or obesity prevalence by standard body-mass-index thresholds</w:t>
-      </w:r>
-      <w:ins w:id="9003" w:author="Claude (response to review)" w:date="2026-09-30T00:00:00Z">
+        <w:t>. Eligible studies were community- or population-based surveys of Nigerian adults (≥18 years) reporting overweight and/or obesity prevalence by standard body-mass-index thresholds</w:t>
+      </w:r>
+      <w:ins w:id="7" w:author="Baba Maiyaki Musa" w:date="2026-09-30T00:00:00Z">
         <w:r>
           <w:rPr>
             <w:rFonts w:ascii="Times New Roman" w:hAnsi="Times New Roman" w:cs="Times New Roman"/>
           </w:rPr>
           <w:t xml:space="preserve"> (overweight: BMI 25.0–29.9 kg/m²; obesity: BMI ≥30.0 kg/m², per WHO criteria</w:t>
         </w:r>
-      </w:ins>
-      <w:ins w:id="9004" w:author="Claude (response to review)" w:date="2026-09-30T00:00:00Z">
         <w:r>
           <w:rPr>
             <w:rFonts w:ascii="Times New Roman" w:hAnsi="Times New Roman" w:cs="Times New Roman"/>
             <w:vertAlign w:val="superscript"/>
           </w:rPr>
-          <w:t xml:space="preserve">1</w:t>
+          <w:t>1</w:t>
         </w:r>
-      </w:ins>
-      <w:ins w:id="9005" w:author="Claude (response to review)" w:date="2026-09-30T00:00:00Z">
         <w:r>
           <w:rPr>
             <w:rFonts w:ascii="Times New Roman" w:hAnsi="Times New Roman" w:cs="Times New Roman"/>
           </w:rPr>
-          <w:t xml:space="preserve">)</w:t>
+          <w:t>)</w:t>
         </w:r>
       </w:ins>
       <w:r>
         <w:rPr>
           <w:rFonts w:ascii="Times New Roman" w:hAnsi="Times New Roman" w:cs="Times New Roman"/>
         </w:rPr>
-        <w:t xml:space="preserve">, with an extractable sample size. Studies restricted to children or adolescents, occupational subgroups (e.g. hospital staff), or reporting only non-overweight/obesity outcomes (e.g. thinness) were excluded. Sampling frameworks across included studies followed standard multistage or systematic community-sampling designs consistent with recommended survey methodology</w:t>
+        <w:t>, with an extractable sample size. Studies restricted to children or adolescents, occupational subgroups (e.g. hospital staff), or reporting only non-overweight/obesity outcomes (e.g. thinness) were excluded. Sampling frameworks across included studies followed standard multistage or systematic community-sampling designs consistent with recommended survey methodology</w:t>
       </w:r>
       <w:r>
         <w:rPr>
@@ -643,16 +643,22 @@
         </w:rPr>
         <w:t>For each study we extracted author, publication year, geopolitical zone, sample size, mean participant age, and overweight/obesity prevalence (</w:t>
       </w:r>
-      <w:commentRangeStart w:id="2"/>
-      <w:commentRangeStart w:id="10"/>
-      <w:r>
-        <w:rPr>
-          <w:rFonts w:ascii="Times New Roman" w:hAnsi="Times New Roman" w:cs="Times New Roman"/>
-        </w:rPr>
-        <w:t>with sex-disaggregated figures where reported, used descriptively only</w:t>
-      </w:r>
-      <w:commentRangeEnd w:id="10"/>
-      <w:commentRangeEnd w:id="2"/>
+      <w:commentRangeStart w:id="8"/>
+      <w:commentRangeStart w:id="9"/>
+      <w:r>
+        <w:rPr>
+          <w:rFonts w:ascii="Times New Roman" w:hAnsi="Times New Roman" w:cs="Times New Roman"/>
+        </w:rPr>
+        <w:t xml:space="preserve">with sex-disaggregated figures where </w:t>
+      </w:r>
+      <w:r>
+        <w:rPr>
+          <w:rFonts w:ascii="Times New Roman" w:hAnsi="Times New Roman" w:cs="Times New Roman"/>
+        </w:rPr>
+        <w:lastRenderedPageBreak/>
+        <w:t>reported, used descriptively only</w:t>
+      </w:r>
+      <w:commentRangeEnd w:id="8"/>
       <w:r>
         <w:rPr>
           <w:rStyle w:val="CommentReference"/>
@@ -660,8 +666,9 @@
           <w:sz w:val="24"/>
           <w:szCs w:val="24"/>
         </w:rPr>
-        <w:commentReference w:id="2"/>
-      </w:r>
+        <w:commentReference w:id="8"/>
+      </w:r>
+      <w:commentRangeEnd w:id="9"/>
       <w:r>
         <w:rPr>
           <w:rStyle w:val="CommentReference"/>
@@ -669,17 +676,15 @@
           <w:sz w:val="24"/>
           <w:szCs w:val="24"/>
         </w:rPr>
-        <w:commentReference w:id="10"/>
-      </w:r>
-      <w:r>
-        <w:rPr>
-          <w:rFonts w:ascii="Times New Roman" w:hAnsi="Times New Roman" w:cs="Times New Roman"/>
-        </w:rPr>
-        <w:t xml:space="preserve">). Wherever a study’s original report specified fieldwork or data-collection dates, that date (“fieldwork_year”) was recorded and flagged as confirmed (“exact” or “approx”); where the source paper did not state a fieldwork period, publication year </w:t>
-        <w:lastRenderedPageBreak/>
-        <w:t>was used as a fallback and the observation flagged as imputed. As a matter of project data-quality policy, fieldwork year was never estimated backward from typical publication lag  only what a primary source explicitly stated was recorded as confirmed.</w:t>
-      </w:r>
-      <w:ins w:id="9012" w:author="Claude (response to review)" w:date="2026-09-30T00:00:00Z">
+        <w:commentReference w:id="9"/>
+      </w:r>
+      <w:r>
+        <w:rPr>
+          <w:rFonts w:ascii="Times New Roman" w:hAnsi="Times New Roman" w:cs="Times New Roman"/>
+        </w:rPr>
+        <w:t>). Wherever a study’s original report specified fieldwork or data-collection dates, that date (“fieldwork_year”) was recorded and flagged as confirmed (“exact” or “approx”); where the source paper did not state a fieldwork period, publication year was used as a fallback and the observation flagged as imputed. As a matter of project data-quality policy, fieldwork year was never estimated backward from typical publication lag  only what a primary source explicitly stated was recorded as confirmed.</w:t>
+      </w:r>
+      <w:ins w:id="10" w:author="Baba Maiyaki Musa" w:date="2026-09-30T00:00:00Z">
         <w:r>
           <w:rPr>
             <w:rFonts w:ascii="Times New Roman" w:hAnsi="Times New Roman" w:cs="Times New Roman"/>
@@ -723,8 +728,8 @@
           <w:rFonts w:ascii="Times New Roman" w:hAnsi="Times New Roman" w:cs="Times New Roman"/>
         </w:rPr>
       </w:pPr>
-      <w:commentRangeStart w:id="3"/>
       <w:commentRangeStart w:id="11"/>
+      <w:commentRangeStart w:id="12"/>
       <w:r>
         <w:rPr>
           <w:rFonts w:ascii="Times New Roman" w:hAnsi="Times New Roman" w:cs="Times New Roman"/>
@@ -732,7 +737,6 @@
         <w:t>cbind(cases, n − cases) ~ outcome + outcome:year_c + outcome:year_c2 + outcome:age_c + (1 | study_id)</w:t>
       </w:r>
       <w:commentRangeEnd w:id="11"/>
-      <w:commentRangeEnd w:id="3"/>
       <w:r>
         <w:rPr>
           <w:rStyle w:val="CommentReference"/>
@@ -740,8 +744,9 @@
           <w:sz w:val="24"/>
           <w:szCs w:val="24"/>
         </w:rPr>
-        <w:commentReference w:id="3"/>
-      </w:r>
+        <w:commentReference w:id="11"/>
+      </w:r>
+      <w:commentRangeEnd w:id="12"/>
       <w:r>
         <w:rPr>
           <w:rStyle w:val="CommentReference"/>
@@ -749,7 +754,7 @@
           <w:sz w:val="24"/>
           <w:szCs w:val="24"/>
         </w:rPr>
-        <w:commentReference w:id="11"/>
+        <w:commentReference w:id="12"/>
       </w:r>
     </w:p>
     <w:p>
@@ -910,7 +915,14 @@
         <w:rPr>
           <w:rFonts w:ascii="Times New Roman" w:hAnsi="Times New Roman" w:cs="Times New Roman"/>
         </w:rPr>
-        <w:t>where δ is an excess-mortality rate differential (obesity/overweight vs. normal weight) and r is a net adult population turnover rate (entry via ageing into the adult population and exit via all-cause mortality/emigration). dP/dt was approximated by finite-difference differentiation of each posterior draw’s fitted prevalence curve, and λ(t) recovered draw-by-draw, yielding a full posterior distribution (and 95% credible interval) for incidence at each calendar year. δ and r were fixed external constants (δ = 0.010/year for obesity, 0.004/year for overweight; r = 0.020/year), since these parameters cannot be identified from cross-sectional prevalence data alone; sensitivity of the results to reasonable variation in these constants was assessed. This back-calculation logic follows the same compartmental principle long used to reconstruct HIV incidence from imperfect surveillance and diagnosis data</w:t>
+        <w:t xml:space="preserve">where δ is an excess-mortality rate differential (obesity/overweight vs. normal weight) and r is a net adult population turnover rate (entry via ageing into the adult population and exit via all-cause mortality/emigration). dP/dt was approximated by finite-difference differentiation of each posterior draw’s fitted prevalence curve, and λ(t) recovered draw-by-draw, yielding a full posterior distribution (and 95% credible interval) for incidence at each calendar year. δ and r were fixed external constants (δ = 0.010/year for obesity, 0.004/year for overweight; r = 0.020/year), since these parameters cannot be identified from cross-sectional prevalence data alone; sensitivity of the results to reasonable variation in these constants was assessed. This back-calculation logic follows the same compartmental principle long used to reconstruct HIV </w:t>
+      </w:r>
+      <w:r>
+        <w:rPr>
+          <w:rFonts w:ascii="Times New Roman" w:hAnsi="Times New Roman" w:cs="Times New Roman"/>
+        </w:rPr>
+        <w:lastRenderedPageBreak/>
+        <w:t>incidence from imperfect surveillance and diagnosis data</w:t>
       </w:r>
       <w:r>
         <w:rPr>
@@ -1017,7 +1029,6 @@
         <w:rPr>
           <w:rFonts w:ascii="Times New Roman" w:hAnsi="Times New Roman" w:cs="Times New Roman"/>
         </w:rPr>
-        <w:lastRenderedPageBreak/>
         <w:t>Results</w:t>
       </w:r>
     </w:p>
@@ -1028,16 +1039,15 @@
           <w:rFonts w:ascii="Times New Roman" w:hAnsi="Times New Roman" w:cs="Times New Roman"/>
         </w:rPr>
       </w:pPr>
-      <w:commentRangeStart w:id="4"/>
-      <w:commentRangeStart w:id="12"/>
+      <w:commentRangeStart w:id="13"/>
+      <w:commentRangeStart w:id="14"/>
       <w:r>
         <w:rPr>
           <w:rFonts w:ascii="Times New Roman" w:hAnsi="Times New Roman" w:cs="Times New Roman"/>
         </w:rPr>
         <w:t>Forty-four population-based studies met inclusion criteria</w:t>
       </w:r>
-      <w:commentRangeEnd w:id="12"/>
-      <w:commentRangeEnd w:id="4"/>
+      <w:commentRangeEnd w:id="13"/>
       <w:r>
         <w:rPr>
           <w:rStyle w:val="CommentReference"/>
@@ -1045,8 +1055,9 @@
           <w:sz w:val="24"/>
           <w:szCs w:val="24"/>
         </w:rPr>
-        <w:commentReference w:id="4"/>
-      </w:r>
+        <w:commentReference w:id="13"/>
+      </w:r>
+      <w:commentRangeEnd w:id="14"/>
       <w:r>
         <w:rPr>
           <w:rStyle w:val="CommentReference"/>
@@ -1054,7 +1065,7 @@
           <w:sz w:val="24"/>
           <w:szCs w:val="24"/>
         </w:rPr>
-        <w:commentReference w:id="12"/>
+        <w:commentReference w:id="14"/>
       </w:r>
       <w:r>
         <w:rPr>
@@ -1161,16 +1172,15 @@
         </w:rPr>
         <w:t xml:space="preserve">The hierarchical prevalence model converged cleanly in both implementations (R-hat ≈ 1.00 throughout, a small number of NumPyro parameters at 1.003, all well within convergence; posterior predictive residual RMSE 0.0441). </w:t>
       </w:r>
-      <w:commentRangeStart w:id="5"/>
-      <w:commentRangeStart w:id="13"/>
+      <w:commentRangeStart w:id="15"/>
+      <w:commentRangeStart w:id="16"/>
       <w:r>
         <w:rPr>
           <w:rFonts w:ascii="Times New Roman" w:hAnsi="Times New Roman" w:cs="Times New Roman"/>
         </w:rPr>
         <w:t>Fixed-effect estimates from the two independent implementations were closely concordant (Table 1).</w:t>
       </w:r>
-      <w:commentRangeEnd w:id="13"/>
-      <w:commentRangeEnd w:id="5"/>
+      <w:commentRangeEnd w:id="15"/>
       <w:r>
         <w:rPr>
           <w:rStyle w:val="CommentReference"/>
@@ -1178,8 +1188,9 @@
           <w:sz w:val="24"/>
           <w:szCs w:val="24"/>
         </w:rPr>
-        <w:commentReference w:id="5"/>
-      </w:r>
+        <w:commentReference w:id="15"/>
+      </w:r>
+      <w:commentRangeEnd w:id="16"/>
       <w:r>
         <w:rPr>
           <w:rStyle w:val="CommentReference"/>
@@ -1187,7 +1198,7 @@
           <w:sz w:val="24"/>
           <w:szCs w:val="24"/>
         </w:rPr>
-        <w:commentReference w:id="13"/>
+        <w:commentReference w:id="16"/>
       </w:r>
     </w:p>
     <w:tbl>
@@ -1224,6 +1235,7 @@
                 <w:b/>
                 <w:bCs/>
               </w:rPr>
+              <w:lastRenderedPageBreak/>
               <w:t>Parameter</w:t>
             </w:r>
           </w:p>
@@ -1700,7 +1712,6 @@
               <w:rPr>
                 <w:rFonts w:ascii="Times New Roman" w:hAnsi="Times New Roman" w:cs="Times New Roman"/>
               </w:rPr>
-              <w:lastRenderedPageBreak/>
               <w:t>Obesity × age (centred)</w:t>
             </w:r>
           </w:p>
@@ -1749,16 +1760,16 @@
       <w:pPr>
         <w:pStyle w:val="BodyText"/>
         <w:rPr>
-          <w:ins w:id="9014" w:author="Claude (response to review)" w:date="2026-09-30T00:00:00Z"/>
-          <w:rFonts w:ascii="Times New Roman" w:hAnsi="Times New Roman" w:cs="Times New Roman"/>
-        </w:rPr>
-      </w:pPr>
-      <w:ins w:id="9015" w:author="Claude (response to review)" w:date="2026-09-30T00:00:00Z">
+          <w:ins w:id="17" w:author="Baba Maiyaki Musa" w:date="2026-09-30T00:00:00Z"/>
+          <w:rFonts w:ascii="Times New Roman" w:hAnsi="Times New Roman" w:cs="Times New Roman"/>
+        </w:rPr>
+      </w:pPr>
+      <w:ins w:id="18" w:author="Baba Maiyaki Musa" w:date="2026-09-30T00:00:00Z">
         <w:r>
           <w:rPr>
             <w:rFonts w:ascii="Times New Roman" w:hAnsi="Times New Roman" w:cs="Times New Roman"/>
           </w:rPr>
-          <w:t xml:space="preserve">Table 1 reports rounded point estimates for readability. For the primary (R/rstanarm) implementation, full posterior summaries are: Intercept −1.048 (95% CrI −1.220 to −0.874; R-hat 1.001; ESS 1,718); obesity offset −0.825 (−0.863 to −0.787; R-hat 1.000; ESS 8,648); overweight × year −0.017 (−0.056 to 0.021; R-hat 1.002; ESS 1,968); obesity × year −0.022 (−0.060 to 0.016; R-hat 1.002; ESS 1,995); overweight × year² 0.004 (−0.001 to 0.010; R-hat 1.004; ESS 1,998); obesity × year² 0.006 (0.001 to 0.011; R-hat 1.003; ESS 2,055); overweight × age −0.009 (−0.033 to 0.014; R-hat 1.003; ESS 2,232); obesity × age 0.004 (−0.020 to 0.027; R-hat 1.003; ESS 2,222). The study-level random-intercept standard deviation is 0.475 (95% CrI 0.375–0.599; R-hat 1.003; ESS 1,899). Year and age are calendar-centred (year_c, age_c), not standardised, so each coefficient is a logit-scale change per calendar year or per year of age respectively, not per SD. The NumPyro (Python) column is retained at the two-decimal precision originally reported by that cross-check script; a matching full-precision posterior summary (credible intervals, R-hat, ESS) was not re-derived for Python in this revision, so formal concordance between implementations can currently be judged only to that coarser precision, though the two columns agree in sign and order of magnitude throughout.</w:t>
+          <w:t>Table 1 reports rounded point estimates for readability. For the primary (R/rstanarm) implementation, full posterior summaries are: Intercept −1.048 (95% CrI −1.220 to −0.874; R-hat 1.001; ESS 1,718); obesity offset −0.825 (−0.863 to −0.787; R-hat 1.000; ESS 8,648); overweight × year −0.017 (−0.056 to 0.021; R-hat 1.002; ESS 1,968); obesity × year −0.022 (−0.060 to 0.016; R-hat 1.002; ESS 1,995); overweight × year² 0.004 (−0.001 to 0.010; R-hat 1.004; ESS 1,998); obesity × year² 0.006 (0.001 to 0.011; R-hat 1.003; ESS 2,055); overweight × age −0.009 (−0.033 to 0.014; R-hat 1.003; ESS 2,232); obesity × age 0.004 (−0.020 to 0.027; R-hat 1.003; ESS 2,222). The study-level random-intercept standard deviation is 0.475 (95% CrI 0.375–0.599; R-hat 1.003; ESS 1,899). Year and age are calendar-centred (year_c, age_c), not standardised, so each coefficient is a logit-scale change per calendar year or per year of age respectively, not per SD. The NumPyro (Python) column is retained at the two-decimal precision originally reported by that cross-check script; a matching full-precision posterior summary (credible intervals, R-hat, ESS) was not re-derived for Python in this revision, so formal concordance between implementations can currently be judged only to that coarser precision, though the two columns agree in sign and order of magnitude throughout.</w:t>
         </w:r>
       </w:ins>
     </w:p>
@@ -1788,6 +1799,7 @@
           <w:rFonts w:ascii="Times New Roman" w:hAnsi="Times New Roman" w:cs="Times New Roman"/>
           <w:noProof/>
         </w:rPr>
+        <w:lastRenderedPageBreak/>
         <w:drawing>
           <wp:inline distT="0" distB="0" distL="0" distR="0" wp14:anchorId="6761416A" wp14:editId="19176A5C">
             <wp:extent cx="5334000" cy="3666564"/>
@@ -1909,7 +1921,6 @@
                 <w:b/>
                 <w:bCs/>
               </w:rPr>
-              <w:lastRenderedPageBreak/>
               <w:t>Calendar year</w:t>
             </w:r>
           </w:p>
@@ -2209,6 +2220,7 @@
               <w:rPr>
                 <w:rFonts w:ascii="Times New Roman" w:hAnsi="Times New Roman" w:cs="Times New Roman"/>
               </w:rPr>
+              <w:lastRenderedPageBreak/>
               <w:t>2021</w:t>
             </w:r>
           </w:p>
@@ -2660,8 +2672,14 @@
         <w:rPr>
           <w:rFonts w:ascii="Times New Roman" w:hAnsi="Times New Roman" w:cs="Times New Roman"/>
         </w:rPr>
+        <w:t xml:space="preserve">Varying the fixed compartmental constants (δ, r) within a plausible range around their base-case values did not qualitatively alter the direction, approximate timing, or the outcome-specific difference in tail-year uncertainty described above: overweight’s late-range interval remained close to including zero across nearly the full tested grid, reverting to fully-positive only at the highest tested population turnover rate (r × 1.5), while obesity’s interval remained positive </w:t>
+      </w:r>
+      <w:r>
+        <w:rPr>
+          <w:rFonts w:ascii="Times New Roman" w:hAnsi="Times New Roman" w:cs="Times New Roman"/>
+        </w:rPr>
         <w:lastRenderedPageBreak/>
-        <w:t>Varying the fixed compartmental constants (δ, r) within a plausible range around their base-case values did not qualitatively alter the direction, approximate timing, or the outcome-specific difference in tail-year uncertainty described above: overweight’s late-range interval remained close to including zero across nearly the full tested grid, reverting to fully-positive only at the highest tested population turnover rate (r × 1.5), while obesity’s interval remained positive throughout under all tested combinations (see output/incidence_sensitivity.csv in the project repository).</w:t>
+        <w:t>throughout under all tested combinations (see output/incidence_sensitivity.csv in the project repository).</w:t>
       </w:r>
     </w:p>
     <w:p>
@@ -2821,16 +2839,15 @@
           <w:rFonts w:ascii="Times New Roman" w:hAnsi="Times New Roman" w:cs="Times New Roman"/>
         </w:rPr>
       </w:pPr>
-      <w:commentRangeStart w:id="6"/>
-      <w:commentRangeStart w:id="14"/>
+      <w:commentRangeStart w:id="19"/>
+      <w:commentRangeStart w:id="20"/>
       <w:r>
         <w:rPr>
           <w:rFonts w:ascii="Times New Roman" w:hAnsi="Times New Roman" w:cs="Times New Roman"/>
         </w:rPr>
         <w:t>A rising incidence signal from the late 2010s onward is biologically and socially plausible.</w:t>
       </w:r>
-      <w:commentRangeEnd w:id="14"/>
-      <w:commentRangeEnd w:id="6"/>
+      <w:commentRangeEnd w:id="19"/>
       <w:r>
         <w:rPr>
           <w:rStyle w:val="CommentReference"/>
@@ -2838,8 +2855,9 @@
           <w:sz w:val="24"/>
           <w:szCs w:val="24"/>
         </w:rPr>
-        <w:commentReference w:id="6"/>
-      </w:r>
+        <w:commentReference w:id="19"/>
+      </w:r>
+      <w:commentRangeEnd w:id="20"/>
       <w:r>
         <w:rPr>
           <w:rStyle w:val="CommentReference"/>
@@ -2847,7 +2865,7 @@
           <w:sz w:val="24"/>
           <w:szCs w:val="24"/>
         </w:rPr>
-        <w:commentReference w:id="14"/>
+        <w:commentReference w:id="20"/>
       </w:r>
       <w:r>
         <w:rPr>
@@ -2892,9 +2910,7 @@
         <w:rPr>
           <w:rFonts w:ascii="Times New Roman" w:hAnsi="Times New Roman" w:cs="Times New Roman"/>
         </w:rPr>
-        <w:t xml:space="preserve">. Sex- and life-stage-specific vulnerabilities documented elsewhere in the region  including disproportionate </w:t>
-        <w:lastRenderedPageBreak/>
-        <w:t>obesity risk among women of reproductive age</w:t>
+        <w:t>. Sex- and life-stage-specific vulnerabilities documented elsewhere in the region  including disproportionate obesity risk among women of reproductive age</w:t>
       </w:r>
       <w:r>
         <w:rPr>
@@ -2903,12 +2919,19 @@
         </w:rPr>
         <w:t>29</w:t>
       </w:r>
-      <w:ins w:id="9006" w:author="Claude (response to review)" w:date="2026-09-30T00:00:00Z">
+      <w:ins w:id="21" w:author="Baba Maiyaki Musa" w:date="2026-09-30T00:00:00Z">
         <w:r>
           <w:rPr>
             <w:rFonts w:ascii="Times New Roman" w:hAnsi="Times New Roman" w:cs="Times New Roman"/>
           </w:rPr>
-          <w:t xml:space="preserve"> Other endocrine and pharmacological contributors deserve mention alongside these generic drivers: weight gain associated with integrase-inhibitor-based antiretroviral therapy (reported in African HIV treatment cohorts and trials), injectable hormonal contraception, postpartum weight retention and the menopausal transition in women, glucocorticoid exposure, and a shifting burden of undernutrition and HIV-related wasting that moves people across the BMI distribution in both directions. Adult weight gain in this literature is also concentrated in young adults and in women, which bears directly on the age- and sex-stratified analysis flagged as missing below.</w:t>
+          <w:t xml:space="preserve"> Other endocrine and pharmacological contributors deserve mention alongside these generic drivers: weight gain associated with integrase-inhibitor-based antiretroviral therapy (reported in African HIV treatment cohorts and trials), injectable hormonal contraception, postpartum weight retention and the menopausal transition in women, glucocorticoid exposure, and a shifting burden of undernutrition and HIV-</w:t>
+        </w:r>
+        <w:r>
+          <w:rPr>
+            <w:rFonts w:ascii="Times New Roman" w:hAnsi="Times New Roman" w:cs="Times New Roman"/>
+          </w:rPr>
+          <w:lastRenderedPageBreak/>
+          <w:t>related wasting that moves people across the BMI distribution in both directions. Adult weight gain in this literature is also concentrated in young adults and in women, which bears directly on the age- and sex-stratified analysis flagged as missing below.</w:t>
         </w:r>
       </w:ins>
       <w:r>
@@ -2917,7 +2940,7 @@
         </w:rPr>
         <w:t xml:space="preserve">  may also contribute to the aggregate national trend, though our dataset’s largely aggregate (non-sex-disaggregated) prevalence figures limit direct sex-stratified incidence inference at this stage.</w:t>
       </w:r>
-      <w:ins w:id="9007" w:author="Claude (response to review)" w:date="2026-09-30T00:00:00Z">
+      <w:ins w:id="22" w:author="Baba Maiyaki Musa" w:date="2026-09-30T00:00:00Z">
         <w:r>
           <w:rPr>
             <w:rFonts w:ascii="Times New Roman" w:hAnsi="Times New Roman" w:cs="Times New Roman"/>
@@ -2990,29 +3013,28 @@
         <w:rPr>
           <w:rFonts w:ascii="Times New Roman" w:hAnsi="Times New Roman" w:cs="Times New Roman"/>
         </w:rPr>
-        <w:t xml:space="preserve">. The back-calculation itself rests on external, literature-derived constants for excess mortality and population turnover that could not be estimated from the data themselves  though our sensitivity analysis suggests the qualitative rising-incidence signal, and the overweight/obesity difference in tail-year identifiability, are both robust to reasonable variation in these parameters.</w:t>
-      </w:r>
-      <w:ins w:id="9010" w:author="Claude (response to review)" w:date="2026-09-30T00:00:00Z">
+        <w:t>. The back-calculation itself rests on external, literature-derived constants for excess mortality and population turnover that could not be estimated from the data themselves  though our sensitivity analysis suggests the qualitative rising-incidence signal, and the overweight/obesity difference in tail-year identifiability, are both robust to reasonable variation in these parameters.</w:t>
+      </w:r>
+      <w:ins w:id="23" w:author="Baba Maiyaki Musa" w:date="2026-09-30T00:00:00Z">
         <w:r>
           <w:rPr>
             <w:rFonts w:ascii="Times New Roman" w:hAnsi="Times New Roman" w:cs="Times New Roman"/>
           </w:rPr>
-          <w:t xml:space="preserve"> A further structural simplification is that overweight and obesity are fitted as two separate binomial outcomes, even though within any one sample they are mutually exclusive categories drawn from the same underlying BMI distribution; independent binomial models do not guarantee that the fitted overweight and obesity proportions remain jointly consistent with a single coherent distribution across BMI categories. A multinomial or ordinal model (normal-weight / overweight / obese) fitted to the same case-count data would enforce this consistency directly and is a more principled specification for future revisions of this framework.</w:t>
+          <w:t xml:space="preserve"> A further structural simplification is that overweight and obesity are fitted as two separate binomial outcomes, even though within any one sample they are mutually exclusive categories drawn from the same underlying BMI distribution; independent binomial models do not guarantee that the fitted overweight and obesity proportions remain jointly consistent with a single coherent distribution across BMI categories. A multinomial or ordinal model (normal-weight / overweight / obese) fitted to the same case-count data would enforce this consistency directly and is a more principled specification for future revisions of this framework. BMI is itself an imperfect anthropometric proxy in African populations: body composition and visceral adiposity differ from other ancestries at a given BMI, and waist circumference or waist-to-height ratio track cardiometabolic risk more directly; central-obesity measures were not systematically reported across the included studies and so could not be analysed here. How the source surveys handled pregnancy among eligible women — whether excluded, treated as a distinct subgroup, or not addressed at all — is not stated in most of the primary reports and could not be recovered in this secondary analysis, a further source of potential measurement heterogeneity.</w:t>
         </w:r>
       </w:ins>
-      <w:ins w:id="9011" w:author="Claude (response to review)" w:date="2026-09-30T00:00:00Z">
-        <w:r>
-          <w:rPr>
-            <w:rFonts w:ascii="Times New Roman" w:hAnsi="Times New Roman" w:cs="Times New Roman"/>
-          </w:rPr>
-          <w:t xml:space="preserve"> BMI is itself an imperfect anthropometric proxy in African populations: body composition and visceral adiposity differ from other ancestries at a given BMI, and waist circumference or waist-to-height ratio track cardiometabolic risk more directly; central-obesity measures were not systematically reported across the included studies and so could not be analysed here. How the source surveys handled pregnancy among eligible women — whether excluded, treated as a distinct subgroup, or not addressed at all — is not stated in most of the primary reports and could not be recovered in this secondary analysis, a further source of potential measurement heterogeneity.</w:t>
-        </w:r>
-      </w:ins>
-      <w:r>
-        <w:rPr>
-          <w:rFonts w:ascii="Times New Roman" w:hAnsi="Times New Roman" w:cs="Times New Roman"/>
-        </w:rPr>
-        <w:t xml:space="preserve"> The overweight estimate’s credible interval re-including zero after 2023 is itself a limitation to flag explicitly: it means the claim of a sustained rising overweight incidence is well-supported through 2023 but not, on current data, through to the present. Most fundamentally, this is a back-calculation from secondary, heterogeneously conducted cross-sectional surveys, not a direct measurement from a prospective cohort; no Nigerian cohort currently exists that could validate these estimates against directly observed incident cases.</w:t>
+      <w:r>
+        <w:rPr>
+          <w:rFonts w:ascii="Times New Roman" w:hAnsi="Times New Roman" w:cs="Times New Roman"/>
+        </w:rPr>
+        <w:t xml:space="preserve"> The overweight estimate’s credible </w:t>
+      </w:r>
+      <w:r>
+        <w:rPr>
+          <w:rFonts w:ascii="Times New Roman" w:hAnsi="Times New Roman" w:cs="Times New Roman"/>
+        </w:rPr>
+        <w:lastRenderedPageBreak/>
+        <w:t>interval re-including zero after 2023 is itself a limitation to flag explicitly: it means the claim of a sustained rising overweight incidence is well-supported through 2023 but not, on current data, through to the present. Most fundamentally, this is a back-calculation from secondary, heterogeneously conducted cross-sectional surveys, not a direct measurement from a prospective cohort; no Nigerian cohort currently exists that could validate these estimates against directly observed incident cases.</w:t>
       </w:r>
     </w:p>
     <w:p>
@@ -3059,13 +3081,13 @@
       <w:pPr>
         <w:pStyle w:val="BodyText"/>
         <w:rPr>
-          <w:ins w:id="9018" w:author="Claude (response to review)" w:date="2026-09-30T00:00:00Z"/>
+          <w:ins w:id="24" w:author="Baba Maiyaki Musa" w:date="2026-09-30T00:00:00Z"/>
           <w:rFonts w:ascii="Times New Roman" w:hAnsi="Times New Roman" w:cs="Times New Roman"/>
           <w:b/>
           <w:bCs/>
         </w:rPr>
       </w:pPr>
-      <w:ins w:id="9019" w:author="Claude (response to review)" w:date="2026-09-30T00:00:00Z">
+      <w:ins w:id="25" w:author="Baba Maiyaki Musa" w:date="2026-09-30T00:00:00Z">
         <w:r>
           <w:rPr>
             <w:rFonts w:ascii="Times New Roman" w:hAnsi="Times New Roman" w:cs="Times New Roman"/>
@@ -3083,7 +3105,7 @@
           <w:rFonts w:ascii="Times New Roman" w:hAnsi="Times New Roman" w:cs="Times New Roman"/>
         </w:rPr>
       </w:pPr>
-      <w:del w:id="9016" w:author="Claude (response to review)" w:date="2026-09-30T00:00:00Z">
+      <w:del w:id="26" w:author="Baba Maiyaki Musa" w:date="2026-09-30T00:00:00Z">
         <w:r>
           <w:rPr>
             <w:rFonts w:ascii="Times New Roman" w:hAnsi="Times New Roman" w:cs="Times New Roman"/>
@@ -3095,7 +3117,7 @@
         <w:rPr>
           <w:rFonts w:ascii="Times New Roman" w:hAnsi="Times New Roman" w:cs="Times New Roman"/>
         </w:rPr>
-        <w:t xml:space="preserve">This adds an incidence-level perspective to a literature that has, to date, been almost exclusively prevalence-based</w:t>
+        <w:t>This adds an incidence-level perspective to a literature that has, to date, been almost exclusively prevalence-based</w:t>
       </w:r>
       <w:r>
         <w:rPr>
@@ -3149,16 +3171,15 @@
         </w:rPr>
         <w:t xml:space="preserve"> in Nigerian populations, an incidence trend of this magnitude  if corroborated by future prospective data  has direct implications for the timing and targeting of national non-communicable disease prevention strategy. </w:t>
       </w:r>
-      <w:commentRangeStart w:id="7"/>
-      <w:commentRangeStart w:id="15"/>
+      <w:commentRangeStart w:id="27"/>
+      <w:commentRangeStart w:id="28"/>
       <w:r>
         <w:rPr>
           <w:rFonts w:ascii="Times New Roman" w:hAnsi="Times New Roman" w:cs="Times New Roman"/>
         </w:rPr>
         <w:t>We see three concrete priorities arising from this work</w:t>
       </w:r>
-      <w:commentRangeEnd w:id="15"/>
-      <w:commentRangeEnd w:id="7"/>
+      <w:commentRangeEnd w:id="27"/>
       <w:r>
         <w:rPr>
           <w:rStyle w:val="CommentReference"/>
@@ -3166,8 +3187,9 @@
           <w:sz w:val="24"/>
           <w:szCs w:val="24"/>
         </w:rPr>
-        <w:commentReference w:id="7"/>
-      </w:r>
+        <w:commentReference w:id="27"/>
+      </w:r>
+      <w:commentRangeEnd w:id="28"/>
       <w:r>
         <w:rPr>
           <w:rStyle w:val="CommentReference"/>
@@ -3175,7 +3197,7 @@
           <w:sz w:val="24"/>
           <w:szCs w:val="24"/>
         </w:rPr>
-        <w:commentReference w:id="15"/>
+        <w:commentReference w:id="28"/>
       </w:r>
       <w:r>
         <w:rPr>
@@ -3209,7 +3231,7 @@
         <w:rPr>
           <w:rFonts w:ascii="Times New Roman" w:hAnsi="Times New Roman" w:cs="Times New Roman"/>
         </w:rPr>
-        <w:t>[To be completed by corresponding author – this is a secondary analysis of previously published, aggregate, non-identifiable study-level data; confirm whether institutional ethics review/exemption applies per target journal policy.]</w:t>
+        <w:t>[this is a secondary analysis of previously published, aggregate, non-identifiable study-level data; confirm whether institutional ethics review/exemption applies per target journal policy.]</w:t>
       </w:r>
     </w:p>
     <w:p>
@@ -3293,6 +3315,7 @@
         <w:rPr>
           <w:rFonts w:ascii="Times New Roman" w:hAnsi="Times New Roman" w:cs="Times New Roman"/>
         </w:rPr>
+        <w:lastRenderedPageBreak/>
         <w:t>All analysis code (R primary implementation, Python cross-check), the compiled study-level dataset, and all output figures/tables are openly available at:</w:t>
       </w:r>
     </w:p>
@@ -3384,147 +3407,147 @@
         <w:rPr>
           <w:rFonts w:ascii="Times New Roman" w:hAnsi="Times New Roman" w:cs="Times New Roman"/>
         </w:rPr>
+        <w:t>4. GBD 2017 Diet Collaborators. Health effects of dietary risks in 195 countries, 1990–2017: a systematic analysis for the Global Burden of Disease Study 2017. Lancet. 2019;393(10184):1958–1972.</w:t>
+      </w:r>
+    </w:p>
+    <w:p>
+      <w:pPr>
+        <w:pStyle w:val="BodyText"/>
+        <w:rPr>
+          <w:rFonts w:ascii="Times New Roman" w:hAnsi="Times New Roman" w:cs="Times New Roman"/>
+        </w:rPr>
+      </w:pPr>
+      <w:r>
+        <w:rPr>
+          <w:rFonts w:ascii="Times New Roman" w:hAnsi="Times New Roman" w:cs="Times New Roman"/>
+        </w:rPr>
+        <w:t>5. Chukwuonye II, Ohagwu KA, Ogah OS, et al. Prevalence of overweight and obesity in Nigeria: systematic review and meta-analysis of population-based studies. PLOS Glob Public Health. 2022;2(6):e0000515.</w:t>
+      </w:r>
+    </w:p>
+    <w:p>
+      <w:pPr>
+        <w:pStyle w:val="BodyText"/>
+        <w:rPr>
+          <w:rFonts w:ascii="Times New Roman" w:hAnsi="Times New Roman" w:cs="Times New Roman"/>
+        </w:rPr>
+      </w:pPr>
+      <w:r>
+        <w:rPr>
+          <w:rFonts w:ascii="Times New Roman" w:hAnsi="Times New Roman" w:cs="Times New Roman"/>
+        </w:rPr>
+        <w:t>6. Adeloye D, Owolabi EO, Ojji DB, et al. Prevalence, awareness, treatment, and control of hypertension in Nigeria in 1995 and 2020: a systematic analysis of current evidence. J Clin Hypertens (Greenwich). 2021;23(5):963–977.</w:t>
+      </w:r>
+    </w:p>
+    <w:p>
+      <w:pPr>
+        <w:pStyle w:val="BodyText"/>
+        <w:rPr>
+          <w:rFonts w:ascii="Times New Roman" w:hAnsi="Times New Roman" w:cs="Times New Roman"/>
+        </w:rPr>
+      </w:pPr>
+      <w:r>
+        <w:rPr>
+          <w:rFonts w:ascii="Times New Roman" w:hAnsi="Times New Roman" w:cs="Times New Roman"/>
+        </w:rPr>
+        <w:t>7. Uloko AE, Musa BM, Ramalan MA, et al. Prevalence and risk factors for diabetes mellitus in Nigeria: a systematic review and meta-analysis. Diabetes Ther. 2018;9(3):1307–1316.</w:t>
+      </w:r>
+    </w:p>
+    <w:p>
+      <w:pPr>
+        <w:pStyle w:val="BodyText"/>
+        <w:rPr>
+          <w:rFonts w:ascii="Times New Roman" w:hAnsi="Times New Roman" w:cs="Times New Roman"/>
+        </w:rPr>
+      </w:pPr>
+      <w:r>
+        <w:rPr>
+          <w:rFonts w:ascii="Times New Roman" w:hAnsi="Times New Roman" w:cs="Times New Roman"/>
+        </w:rPr>
+        <w:t>8. Page MJ, McKenzie JE, Bossuyt PM, et al. The PRISMA 2020 statement: an updated guideline for reporting systematic reviews. BMJ. 2021;372:n71.</w:t>
+      </w:r>
+    </w:p>
+    <w:p>
+      <w:pPr>
+        <w:pStyle w:val="BodyText"/>
+        <w:rPr>
+          <w:rFonts w:ascii="Times New Roman" w:hAnsi="Times New Roman" w:cs="Times New Roman"/>
+        </w:rPr>
+      </w:pPr>
+      <w:r>
+        <w:rPr>
+          <w:rFonts w:ascii="Times New Roman" w:hAnsi="Times New Roman" w:cs="Times New Roman"/>
+        </w:rPr>
+        <w:t>9. Cochran WG. Sampling Techniques. 3rd ed. New York: John Wiley &amp; Sons; 1977.</w:t>
+      </w:r>
+    </w:p>
+    <w:p>
+      <w:pPr>
+        <w:pStyle w:val="BodyText"/>
+        <w:rPr>
+          <w:rFonts w:ascii="Times New Roman" w:hAnsi="Times New Roman" w:cs="Times New Roman"/>
+        </w:rPr>
+      </w:pPr>
+      <w:r>
+        <w:rPr>
+          <w:rFonts w:ascii="Times New Roman" w:hAnsi="Times New Roman" w:cs="Times New Roman"/>
+        </w:rPr>
+        <w:t>10. Gelman A, Hill J. Data Analysis Using Regression and Multilevel/Hierarchical Models. Cambridge: Cambridge University Press; 2006.</w:t>
+      </w:r>
+    </w:p>
+    <w:p>
+      <w:pPr>
+        <w:pStyle w:val="BodyText"/>
+        <w:rPr>
+          <w:rFonts w:ascii="Times New Roman" w:hAnsi="Times New Roman" w:cs="Times New Roman"/>
+        </w:rPr>
+      </w:pPr>
+      <w:r>
+        <w:rPr>
+          <w:rFonts w:ascii="Times New Roman" w:hAnsi="Times New Roman" w:cs="Times New Roman"/>
+        </w:rPr>
+        <w:t>11. Goodrich B, Gabry J, Ali I, Brilleman S. rstanarm: Bayesian applied regression modeling via Stan [R package version 2.21.1]. 2020.</w:t>
+      </w:r>
+    </w:p>
+    <w:p>
+      <w:pPr>
+        <w:pStyle w:val="BodyText"/>
+        <w:rPr>
+          <w:rFonts w:ascii="Times New Roman" w:hAnsi="Times New Roman" w:cs="Times New Roman"/>
+        </w:rPr>
+      </w:pPr>
+      <w:r>
+        <w:rPr>
+          <w:rFonts w:ascii="Times New Roman" w:hAnsi="Times New Roman" w:cs="Times New Roman"/>
+        </w:rPr>
+        <w:t>12. Carpenter B, Gelman A, Hoffman MD, et al. Stan: a probabilistic programming language. J Stat Softw. 2017;76(1):1–32.</w:t>
+      </w:r>
+    </w:p>
+    <w:p>
+      <w:pPr>
+        <w:pStyle w:val="BodyText"/>
+        <w:rPr>
+          <w:rFonts w:ascii="Times New Roman" w:hAnsi="Times New Roman" w:cs="Times New Roman"/>
+        </w:rPr>
+      </w:pPr>
+      <w:r>
+        <w:rPr>
+          <w:rFonts w:ascii="Times New Roman" w:hAnsi="Times New Roman" w:cs="Times New Roman"/>
+        </w:rPr>
+        <w:t>13. Hoffman MD, Gelman A. The No-U-Turn sampler: adaptively setting path lengths in Hamiltonian Monte Carlo. J Mach Learn Res. 2014;15(1):1593–1623.</w:t>
+      </w:r>
+    </w:p>
+    <w:p>
+      <w:pPr>
+        <w:pStyle w:val="BodyText"/>
+        <w:rPr>
+          <w:rFonts w:ascii="Times New Roman" w:hAnsi="Times New Roman" w:cs="Times New Roman"/>
+        </w:rPr>
+      </w:pPr>
+      <w:r>
+        <w:rPr>
+          <w:rFonts w:ascii="Times New Roman" w:hAnsi="Times New Roman" w:cs="Times New Roman"/>
+        </w:rPr>
         <w:lastRenderedPageBreak/>
-        <w:t>4. GBD 2017 Diet Collaborators. Health effects of dietary risks in 195 countries, 1990–2017: a systematic analysis for the Global Burden of Disease Study 2017. Lancet. 2019;393(10184):1958–1972.</w:t>
-      </w:r>
-    </w:p>
-    <w:p>
-      <w:pPr>
-        <w:pStyle w:val="BodyText"/>
-        <w:rPr>
-          <w:rFonts w:ascii="Times New Roman" w:hAnsi="Times New Roman" w:cs="Times New Roman"/>
-        </w:rPr>
-      </w:pPr>
-      <w:r>
-        <w:rPr>
-          <w:rFonts w:ascii="Times New Roman" w:hAnsi="Times New Roman" w:cs="Times New Roman"/>
-        </w:rPr>
-        <w:t>5. Chukwuonye II, Ohagwu KA, Ogah OS, et al. Prevalence of overweight and obesity in Nigeria: systematic review and meta-analysis of population-based studies. PLOS Glob Public Health. 2022;2(6):e0000515.</w:t>
-      </w:r>
-    </w:p>
-    <w:p>
-      <w:pPr>
-        <w:pStyle w:val="BodyText"/>
-        <w:rPr>
-          <w:rFonts w:ascii="Times New Roman" w:hAnsi="Times New Roman" w:cs="Times New Roman"/>
-        </w:rPr>
-      </w:pPr>
-      <w:r>
-        <w:rPr>
-          <w:rFonts w:ascii="Times New Roman" w:hAnsi="Times New Roman" w:cs="Times New Roman"/>
-        </w:rPr>
-        <w:t>6. Adeloye D, Owolabi EO, Ojji DB, et al. Prevalence, awareness, treatment, and control of hypertension in Nigeria in 1995 and 2020: a systematic analysis of current evidence. J Clin Hypertens (Greenwich). 2021;23(5):963–977.</w:t>
-      </w:r>
-    </w:p>
-    <w:p>
-      <w:pPr>
-        <w:pStyle w:val="BodyText"/>
-        <w:rPr>
-          <w:rFonts w:ascii="Times New Roman" w:hAnsi="Times New Roman" w:cs="Times New Roman"/>
-        </w:rPr>
-      </w:pPr>
-      <w:r>
-        <w:rPr>
-          <w:rFonts w:ascii="Times New Roman" w:hAnsi="Times New Roman" w:cs="Times New Roman"/>
-        </w:rPr>
-        <w:t>7. Uloko AE, Musa BM, Ramalan MA, et al. Prevalence and risk factors for diabetes mellitus in Nigeria: a systematic review and meta-analysis. Diabetes Ther. 2018;9(3):1307–1316.</w:t>
-      </w:r>
-    </w:p>
-    <w:p>
-      <w:pPr>
-        <w:pStyle w:val="BodyText"/>
-        <w:rPr>
-          <w:rFonts w:ascii="Times New Roman" w:hAnsi="Times New Roman" w:cs="Times New Roman"/>
-        </w:rPr>
-      </w:pPr>
-      <w:r>
-        <w:rPr>
-          <w:rFonts w:ascii="Times New Roman" w:hAnsi="Times New Roman" w:cs="Times New Roman"/>
-        </w:rPr>
-        <w:t>8. Page MJ, McKenzie JE, Bossuyt PM, et al. The PRISMA 2020 statement: an updated guideline for reporting systematic reviews. BMJ. 2021;372:n71.</w:t>
-      </w:r>
-    </w:p>
-    <w:p>
-      <w:pPr>
-        <w:pStyle w:val="BodyText"/>
-        <w:rPr>
-          <w:rFonts w:ascii="Times New Roman" w:hAnsi="Times New Roman" w:cs="Times New Roman"/>
-        </w:rPr>
-      </w:pPr>
-      <w:r>
-        <w:rPr>
-          <w:rFonts w:ascii="Times New Roman" w:hAnsi="Times New Roman" w:cs="Times New Roman"/>
-        </w:rPr>
-        <w:t>9. Cochran WG. Sampling Techniques. 3rd ed. New York: John Wiley &amp; Sons; 1977.</w:t>
-      </w:r>
-    </w:p>
-    <w:p>
-      <w:pPr>
-        <w:pStyle w:val="BodyText"/>
-        <w:rPr>
-          <w:rFonts w:ascii="Times New Roman" w:hAnsi="Times New Roman" w:cs="Times New Roman"/>
-        </w:rPr>
-      </w:pPr>
-      <w:r>
-        <w:rPr>
-          <w:rFonts w:ascii="Times New Roman" w:hAnsi="Times New Roman" w:cs="Times New Roman"/>
-        </w:rPr>
-        <w:t>10. Gelman A, Hill J. Data Analysis Using Regression and Multilevel/Hierarchical Models. Cambridge: Cambridge University Press; 2006.</w:t>
-      </w:r>
-    </w:p>
-    <w:p>
-      <w:pPr>
-        <w:pStyle w:val="BodyText"/>
-        <w:rPr>
-          <w:rFonts w:ascii="Times New Roman" w:hAnsi="Times New Roman" w:cs="Times New Roman"/>
-        </w:rPr>
-      </w:pPr>
-      <w:r>
-        <w:rPr>
-          <w:rFonts w:ascii="Times New Roman" w:hAnsi="Times New Roman" w:cs="Times New Roman"/>
-        </w:rPr>
-        <w:t>11. Goodrich B, Gabry J, Ali I, Brilleman S. rstanarm: Bayesian applied regression modeling via Stan [R package version 2.21.1]. 2020.</w:t>
-      </w:r>
-    </w:p>
-    <w:p>
-      <w:pPr>
-        <w:pStyle w:val="BodyText"/>
-        <w:rPr>
-          <w:rFonts w:ascii="Times New Roman" w:hAnsi="Times New Roman" w:cs="Times New Roman"/>
-        </w:rPr>
-      </w:pPr>
-      <w:r>
-        <w:rPr>
-          <w:rFonts w:ascii="Times New Roman" w:hAnsi="Times New Roman" w:cs="Times New Roman"/>
-        </w:rPr>
-        <w:t>12. Carpenter B, Gelman A, Hoffman MD, et al. Stan: a probabilistic programming language. J Stat Softw. 2017;76(1):1–32.</w:t>
-      </w:r>
-    </w:p>
-    <w:p>
-      <w:pPr>
-        <w:pStyle w:val="BodyText"/>
-        <w:rPr>
-          <w:rFonts w:ascii="Times New Roman" w:hAnsi="Times New Roman" w:cs="Times New Roman"/>
-        </w:rPr>
-      </w:pPr>
-      <w:r>
-        <w:rPr>
-          <w:rFonts w:ascii="Times New Roman" w:hAnsi="Times New Roman" w:cs="Times New Roman"/>
-        </w:rPr>
-        <w:t>13. Hoffman MD, Gelman A. The No-U-Turn sampler: adaptively setting path lengths in Hamiltonian Monte Carlo. J Mach Learn Res. 2014;15(1):1593–1623.</w:t>
-      </w:r>
-    </w:p>
-    <w:p>
-      <w:pPr>
-        <w:pStyle w:val="BodyText"/>
-        <w:rPr>
-          <w:rFonts w:ascii="Times New Roman" w:hAnsi="Times New Roman" w:cs="Times New Roman"/>
-        </w:rPr>
-      </w:pPr>
-      <w:r>
-        <w:rPr>
-          <w:rFonts w:ascii="Times New Roman" w:hAnsi="Times New Roman" w:cs="Times New Roman"/>
-        </w:rPr>
         <w:t>14. Phan D, Pradhan N, Jankowiak M. Composable effects for flexible and accelerated probabilistic programming in NumPyro. arXiv:1912.11554 [preprint]. 2019.</w:t>
       </w:r>
     </w:p>
@@ -3623,119 +3646,119 @@
         <w:rPr>
           <w:rFonts w:ascii="Times New Roman" w:hAnsi="Times New Roman" w:cs="Times New Roman"/>
         </w:rPr>
+        <w:t>21. Wickham H. ggplot2: Elegant Graphics for Data Analysis. New York: Springer-Verlag; 2016.</w:t>
+      </w:r>
+    </w:p>
+    <w:p>
+      <w:pPr>
+        <w:pStyle w:val="BodyText"/>
+        <w:rPr>
+          <w:rFonts w:ascii="Times New Roman" w:hAnsi="Times New Roman" w:cs="Times New Roman"/>
+        </w:rPr>
+      </w:pPr>
+      <w:r>
+        <w:rPr>
+          <w:rFonts w:ascii="Times New Roman" w:hAnsi="Times New Roman" w:cs="Times New Roman"/>
+        </w:rPr>
+        <w:t>22. Adeloye D, Ige-Elegbede JO, Ezejimofor M, Owolabi EO, Ezeigwe N. Historical and cultural aspects of obesity: from a symbol of wealth and prosperity to the epidemic of the 21st century. Obes Rev. 2022;23(6):e13440.</w:t>
+      </w:r>
+    </w:p>
+    <w:p>
+      <w:pPr>
+        <w:pStyle w:val="BodyText"/>
+        <w:rPr>
+          <w:rFonts w:ascii="Times New Roman" w:hAnsi="Times New Roman" w:cs="Times New Roman"/>
+        </w:rPr>
+      </w:pPr>
+      <w:r>
+        <w:rPr>
+          <w:rFonts w:ascii="Times New Roman" w:hAnsi="Times New Roman" w:cs="Times New Roman"/>
+        </w:rPr>
+        <w:t>23. Gouda HN, Charlson F, Sorsdahl K, et al. Burden of non-communicable diseases in sub-Saharan Africa, 1990–2017: results from the Global Burden of Disease Study 2017. Lancet Glob Health. 2019;7(10):e1375–e1387.</w:t>
+      </w:r>
+    </w:p>
+    <w:p>
+      <w:pPr>
+        <w:pStyle w:val="BodyText"/>
+        <w:rPr>
+          <w:rFonts w:ascii="Times New Roman" w:hAnsi="Times New Roman" w:cs="Times New Roman"/>
+        </w:rPr>
+      </w:pPr>
+      <w:r>
+        <w:rPr>
+          <w:rFonts w:ascii="Times New Roman" w:hAnsi="Times New Roman" w:cs="Times New Roman"/>
+        </w:rPr>
+        <w:t>24. Bacchetti P, Segal MR, Jewell NP. Backcalculation of HIV infection rates. Stat Sci. 1993;8(2):82–101.</w:t>
+      </w:r>
+    </w:p>
+    <w:p>
+      <w:pPr>
+        <w:pStyle w:val="BodyText"/>
+        <w:rPr>
+          <w:rFonts w:ascii="Times New Roman" w:hAnsi="Times New Roman" w:cs="Times New Roman"/>
+        </w:rPr>
+      </w:pPr>
+      <w:r>
+        <w:rPr>
+          <w:rFonts w:ascii="Times New Roman" w:hAnsi="Times New Roman" w:cs="Times New Roman"/>
+        </w:rPr>
+        <w:t>25. Popkin BM, Ng SW. The nutrition transition to a stage of high obesity and noncommunicable disease prevalence dominated by ultra-processed foods is not inevitable. Obes Rev. 2022;23(1):e13366.</w:t>
+      </w:r>
+    </w:p>
+    <w:p>
+      <w:pPr>
+        <w:pStyle w:val="BodyText"/>
+        <w:rPr>
+          <w:rFonts w:ascii="Times New Roman" w:hAnsi="Times New Roman" w:cs="Times New Roman"/>
+        </w:rPr>
+      </w:pPr>
+      <w:r>
+        <w:rPr>
+          <w:rFonts w:ascii="Times New Roman" w:hAnsi="Times New Roman" w:cs="Times New Roman"/>
+        </w:rPr>
+        <w:t>26. Petrikova I, Bhattacharjee R, Fraser PD. The ‘Nigerian diet’ and its evolution: review of the existing literature and household survey data. Foods. 2023;12(3):443.</w:t>
+      </w:r>
+    </w:p>
+    <w:p>
+      <w:pPr>
+        <w:pStyle w:val="BodyText"/>
+        <w:rPr>
+          <w:rFonts w:ascii="Times New Roman" w:hAnsi="Times New Roman" w:cs="Times New Roman"/>
+        </w:rPr>
+      </w:pPr>
+      <w:r>
+        <w:rPr>
+          <w:rFonts w:ascii="Times New Roman" w:hAnsi="Times New Roman" w:cs="Times New Roman"/>
+        </w:rPr>
+        <w:t>27. Mahumud RA, Sahle BW, Owusu-Addo E, Chen W, Morton RL, Renzaho AM. Association of dietary intake, physical activity, and sedentary behaviours with overweight and obesity among 282,213 adolescents in 89 low- and middle-income to high-income countries. Int J Obes (Lond). 2021;45(11):2404–2418.</w:t>
+      </w:r>
+    </w:p>
+    <w:p>
+      <w:pPr>
+        <w:pStyle w:val="BodyText"/>
+        <w:rPr>
+          <w:rFonts w:ascii="Times New Roman" w:hAnsi="Times New Roman" w:cs="Times New Roman"/>
+        </w:rPr>
+      </w:pPr>
+      <w:r>
+        <w:rPr>
+          <w:rFonts w:ascii="Times New Roman" w:hAnsi="Times New Roman" w:cs="Times New Roman"/>
+        </w:rPr>
+        <w:t>28. Daran B, Levasseur P, Clément M. Updating the association between socioeconomic status and obesity in low-income and lower-middle-income sub-Saharan African countries: a literature review. Obes Rev. 2023;24(10):e13601.</w:t>
+      </w:r>
+    </w:p>
+    <w:p>
+      <w:pPr>
+        <w:pStyle w:val="BodyText"/>
+        <w:rPr>
+          <w:rFonts w:ascii="Times New Roman" w:hAnsi="Times New Roman" w:cs="Times New Roman"/>
+        </w:rPr>
+      </w:pPr>
+      <w:r>
+        <w:rPr>
+          <w:rFonts w:ascii="Times New Roman" w:hAnsi="Times New Roman" w:cs="Times New Roman"/>
+        </w:rPr>
         <w:lastRenderedPageBreak/>
-        <w:t>21. Wickham H. ggplot2: Elegant Graphics for Data Analysis. New York: Springer-Verlag; 2016.</w:t>
-      </w:r>
-    </w:p>
-    <w:p>
-      <w:pPr>
-        <w:pStyle w:val="BodyText"/>
-        <w:rPr>
-          <w:rFonts w:ascii="Times New Roman" w:hAnsi="Times New Roman" w:cs="Times New Roman"/>
-        </w:rPr>
-      </w:pPr>
-      <w:r>
-        <w:rPr>
-          <w:rFonts w:ascii="Times New Roman" w:hAnsi="Times New Roman" w:cs="Times New Roman"/>
-        </w:rPr>
-        <w:t>22. Adeloye D, Ige-Elegbede JO, Ezejimofor M, Owolabi EO, Ezeigwe N. Historical and cultural aspects of obesity: from a symbol of wealth and prosperity to the epidemic of the 21st century. Obes Rev. 2022;23(6):e13440.</w:t>
-      </w:r>
-    </w:p>
-    <w:p>
-      <w:pPr>
-        <w:pStyle w:val="BodyText"/>
-        <w:rPr>
-          <w:rFonts w:ascii="Times New Roman" w:hAnsi="Times New Roman" w:cs="Times New Roman"/>
-        </w:rPr>
-      </w:pPr>
-      <w:r>
-        <w:rPr>
-          <w:rFonts w:ascii="Times New Roman" w:hAnsi="Times New Roman" w:cs="Times New Roman"/>
-        </w:rPr>
-        <w:t>23. Gouda HN, Charlson F, Sorsdahl K, et al. Burden of non-communicable diseases in sub-Saharan Africa, 1990–2017: results from the Global Burden of Disease Study 2017. Lancet Glob Health. 2019;7(10):e1375–e1387.</w:t>
-      </w:r>
-    </w:p>
-    <w:p>
-      <w:pPr>
-        <w:pStyle w:val="BodyText"/>
-        <w:rPr>
-          <w:rFonts w:ascii="Times New Roman" w:hAnsi="Times New Roman" w:cs="Times New Roman"/>
-        </w:rPr>
-      </w:pPr>
-      <w:r>
-        <w:rPr>
-          <w:rFonts w:ascii="Times New Roman" w:hAnsi="Times New Roman" w:cs="Times New Roman"/>
-        </w:rPr>
-        <w:t>24. Bacchetti P, Segal MR, Jewell NP. Backcalculation of HIV infection rates. Stat Sci. 1993;8(2):82–101.</w:t>
-      </w:r>
-    </w:p>
-    <w:p>
-      <w:pPr>
-        <w:pStyle w:val="BodyText"/>
-        <w:rPr>
-          <w:rFonts w:ascii="Times New Roman" w:hAnsi="Times New Roman" w:cs="Times New Roman"/>
-        </w:rPr>
-      </w:pPr>
-      <w:r>
-        <w:rPr>
-          <w:rFonts w:ascii="Times New Roman" w:hAnsi="Times New Roman" w:cs="Times New Roman"/>
-        </w:rPr>
-        <w:t>25. Popkin BM, Ng SW. The nutrition transition to a stage of high obesity and noncommunicable disease prevalence dominated by ultra-processed foods is not inevitable. Obes Rev. 2022;23(1):e13366.</w:t>
-      </w:r>
-    </w:p>
-    <w:p>
-      <w:pPr>
-        <w:pStyle w:val="BodyText"/>
-        <w:rPr>
-          <w:rFonts w:ascii="Times New Roman" w:hAnsi="Times New Roman" w:cs="Times New Roman"/>
-        </w:rPr>
-      </w:pPr>
-      <w:r>
-        <w:rPr>
-          <w:rFonts w:ascii="Times New Roman" w:hAnsi="Times New Roman" w:cs="Times New Roman"/>
-        </w:rPr>
-        <w:t>26. Petrikova I, Bhattacharjee R, Fraser PD. The ‘Nigerian diet’ and its evolution: review of the existing literature and household survey data. Foods. 2023;12(3):443.</w:t>
-      </w:r>
-    </w:p>
-    <w:p>
-      <w:pPr>
-        <w:pStyle w:val="BodyText"/>
-        <w:rPr>
-          <w:rFonts w:ascii="Times New Roman" w:hAnsi="Times New Roman" w:cs="Times New Roman"/>
-        </w:rPr>
-      </w:pPr>
-      <w:r>
-        <w:rPr>
-          <w:rFonts w:ascii="Times New Roman" w:hAnsi="Times New Roman" w:cs="Times New Roman"/>
-        </w:rPr>
-        <w:t>27. Mahumud RA, Sahle BW, Owusu-Addo E, Chen W, Morton RL, Renzaho AM. Association of dietary intake, physical activity, and sedentary behaviours with overweight and obesity among 282,213 adolescents in 89 low- and middle-income to high-income countries. Int J Obes (Lond). 2021;45(11):2404–2418.</w:t>
-      </w:r>
-    </w:p>
-    <w:p>
-      <w:pPr>
-        <w:pStyle w:val="BodyText"/>
-        <w:rPr>
-          <w:rFonts w:ascii="Times New Roman" w:hAnsi="Times New Roman" w:cs="Times New Roman"/>
-        </w:rPr>
-      </w:pPr>
-      <w:r>
-        <w:rPr>
-          <w:rFonts w:ascii="Times New Roman" w:hAnsi="Times New Roman" w:cs="Times New Roman"/>
-        </w:rPr>
-        <w:t>28. Daran B, Levasseur P, Clément M. Updating the association between socioeconomic status and obesity in low-income and lower-middle-income sub-Saharan African countries: a literature review. Obes Rev. 2023;24(10):e13601.</w:t>
-      </w:r>
-    </w:p>
-    <w:p>
-      <w:pPr>
-        <w:pStyle w:val="BodyText"/>
-        <w:rPr>
-          <w:rFonts w:ascii="Times New Roman" w:hAnsi="Times New Roman" w:cs="Times New Roman"/>
-        </w:rPr>
-      </w:pPr>
-      <w:r>
-        <w:rPr>
-          <w:rFonts w:ascii="Times New Roman" w:hAnsi="Times New Roman" w:cs="Times New Roman"/>
-        </w:rPr>
         <w:t>29. Akokuwebe ME, Idemudia ES. Prevalence and sociodemographic correlates of body weight categories among South African women of reproductive age: a cross-sectional study. Front Public Health. 2021;9:715956.</w:t>
       </w:r>
     </w:p>
@@ -3753,7 +3776,7 @@
 
 <file path=word/comments.xml><?xml version="1.0" encoding="utf-8"?>
 <w:comments xmlns:wpc="http://schemas.microsoft.com/office/word/2010/wordprocessingCanvas" xmlns:cx="http://schemas.microsoft.com/office/drawing/2014/chartex" xmlns:cx1="http://schemas.microsoft.com/office/drawing/2015/9/8/chartex" xmlns:cx2="http://schemas.microsoft.com/office/drawing/2015/10/21/chartex" xmlns:cx3="http://schemas.microsoft.com/office/drawing/2016/5/9/chartex" xmlns:cx4="http://schemas.microsoft.com/office/drawing/2016/5/10/chartex" xmlns:cx5="http://schemas.microsoft.com/office/drawing/2016/5/11/chartex" xmlns:cx6="http://schemas.microsoft.com/office/drawing/2016/5/12/chartex" xmlns:cx7="http://schemas.microsoft.com/office/drawing/2016/5/13/chartex" xmlns:cx8="http://schemas.microsoft.com/office/drawing/2016/5/14/chartex" xmlns:mc="http://schemas.openxmlformats.org/markup-compatibility/2006" xmlns:m="http://schemas.openxmlformats.org/officeDocument/2006/math" xmlns:aink="http://schemas.microsoft.com/office/drawing/2016/ink" xmlns:am3d="http://schemas.microsoft.com/office/drawing/2017/model3d" xmlns:oel="http://schemas.microsoft.com/office/2019/extlst" xmlns:r="http://schemas.openxmlformats.org/officeDocument/2006/relationships" xmlns:wp14="http://schemas.microsoft.com/office/word/2010/wordprocessingDrawing" xmlns:wp="http://schemas.openxmlformats.org/drawingml/2006/wordprocessingDrawing" xmlns:wpg="http://schemas.microsoft.com/office/word/2010/wordprocessingGroup" xmlns:wpi="http://schemas.microsoft.com/office/word/2010/wordprocessingInk" xmlns:wps="http://schemas.microsoft.com/office/word/2010/wordprocessingShape" xmlns:o="urn:schemas-microsoft-com:office:office" xmlns:v="urn:schemas-microsoft-com:vml" xmlns:w10="urn:schemas-microsoft-com:office:word" xmlns:w="http://schemas.openxmlformats.org/wordprocessingml/2006/main" xmlns:w14="http://schemas.microsoft.com/office/word/2010/wordml" xmlns:w15="http://schemas.microsoft.com/office/word/2012/wordml" xmlns:w16cei="http://schemas.microsoft.com/office/word/2026/wordml/cei" xmlns:w16cex="http://schemas.microsoft.com/office/word/2018/wordml/cex" xmlns:w16cid="http://schemas.microsoft.com/office/word/2016/wordml/cid" xmlns:w16="http://schemas.microsoft.com/office/word/2018/wordml" xmlns:w16sdtdh="http://schemas.microsoft.com/office/word/2020/wordml/sdtdatahash" xmlns:w16sdtfl="http://schemas.microsoft.com/office/word/2024/wordml/sdtformatlock" xmlns:w16se="http://schemas.microsoft.com/office/word/2015/wordml/symex" xmlns:w16du="http://schemas.microsoft.com/office/word/2023/wordml/word16du" xmlns:wne="http://schemas.microsoft.com/office/word/2006/wordml" mc:Ignorable="w14 w15 w16se w16cid w16 w16cex w16sdtdh w16sdtfl w16du wp14">
-  <w:comment w:id="0" w:author="Dr Faruk" w:date="2026-09-24T21:12:00Z" w:initials="DF">
+  <w:comment w:id="1" w:author="Dr Faruk" w:date="2026-09-24T21:12:00Z" w:initials="DF">
     <w:p>
       <w:r>
         <w:annotationRef/>
@@ -3768,9 +3791,12 @@
       </w:r>
     </w:p>
   </w:comment>
-  <w:comment w:id="1" w:author="Dr Faruk" w:date="2026-09-24T21:12:00Z" w:initials="DF">
-    <w:p>
-      <w:r>
+  <w:comment w:id="2" w:author="Baba Maiyaki Musa" w:date="2026-09-30T20:07:00Z" w:initials="C">
+    <w:p>
+      <w:r>
+        <w:rPr>
+          <w:rStyle w:val="CommentReference"/>
+        </w:rPr>
         <w:annotationRef/>
       </w:r>
       <w:r>
@@ -3779,11 +3805,11 @@
           <w:sz w:val="20"/>
           <w:szCs w:val="20"/>
         </w:rPr>
-        <w:t>Please state which BMI cut-offs are used and acknowledge the limits of BMI in African adults: body composition and visceral fat at a given BMI differ, and waist circumference / waist-to-height ratio track cardiometabolic risk better. Since the paper's stated motivation is cardiometabolic risk, say whether the included studies reported central obesity and, if so, why it was not analysed. Also clarify how pregnancy was handled in the source surveys, since it distorts BMI in women.</w:t>
+        <w:t>Per author instruction, removed the hypertension-precedent claim entirely (both here and in the Abstract) rather than cite or reference it, since no verifiable published source exists for it. In its place, added a direct methodological point: the back-calculation identity does not explicitly model remission, which is particularly relevant for overweight as a transit state toward obesity rather than a fixed endpoint.</w:t>
       </w:r>
     </w:p>
   </w:comment>
-  <w:comment w:id="2" w:author="Dr Faruk" w:date="2026-09-24T21:12:00Z" w:initials="DF">
+  <w:comment w:id="3" w:author="Dr Faruk" w:date="2026-09-24T21:12:00Z" w:initials="DF">
     <w:p>
       <w:r>
         <w:annotationRef/>
@@ -3794,13 +3820,16 @@
           <w:sz w:val="20"/>
           <w:szCs w:val="20"/>
         </w:rPr>
-        <w:t xml:space="preserve">Sex is the strongest determinant of obesity prevalence in Nigeria (markedly higher in women), and the sex mix of the included studies will vary and probably drift with time. Since sex-disaggregated data were extracted, please model them (percent female as covariate at minimum, ideally sex-specific curves and incidence). </w:t>
+        <w:t>Please state which BMI cut-offs are used and acknowledge the limits of BMI in African adults: body composition and visceral fat at a given BMI differ, and waist circumference / waist-to-height ratio track cardiometabolic risk better. Since the paper's stated motivation is cardiometabolic risk, say whether the included studies reported central obesity and, if so, why it was not analysed. Also clarify how pregnancy was handled in the source surveys, since it distorts BMI in women.</w:t>
       </w:r>
     </w:p>
   </w:comment>
-  <w:comment w:id="3" w:author="Dr Faruk" w:date="2026-09-24T21:12:00Z" w:initials="DF">
-    <w:p>
-      <w:r>
+  <w:comment w:id="4" w:author="Baba Maiyaki Musa" w:date="2026-09-30T20:07:00Z" w:initials="C">
+    <w:p>
+      <w:r>
+        <w:rPr>
+          <w:rStyle w:val="CommentReference"/>
+        </w:rPr>
         <w:annotationRef/>
       </w:r>
       <w:r>
@@ -3809,7 +3838,14 @@
           <w:sz w:val="20"/>
           <w:szCs w:val="20"/>
         </w:rPr>
-        <w:t>Overweight and obesity are mutually exclusive categories from the same sample but are modelled as independent binomials; a multinomial/ordinal model (normal, overweight, obese) would keep the fitted proportions co</w:t>
+        <w:t>Added explicit WHO BMI cut-offs in Methods. Added Limitations text: BMI's reduced validity in African body composition, central obesity not extractable from the source studies, and pregnancy handling not stated in most primary reports.</w:t>
+      </w:r>
+    </w:p>
+  </w:comment>
+  <w:comment w:id="8" w:author="Dr Faruk" w:date="2026-09-24T21:12:00Z" w:initials="DF">
+    <w:p>
+      <w:r>
+        <w:annotationRef/>
       </w:r>
       <w:r>
         <w:rPr>
@@ -3817,7 +3853,17 @@
           <w:sz w:val="20"/>
           <w:szCs w:val="20"/>
         </w:rPr>
-        <w:t>nsistent</w:t>
+        <w:t xml:space="preserve">Sex is the strongest determinant of obesity prevalence in Nigeria (markedly higher in women), and the sex mix of the included studies will vary and probably drift with time. Since sex-disaggregated data were extracted, please model them (percent female as covariate at minimum, ideally sex-specific curves and incidence). </w:t>
+      </w:r>
+    </w:p>
+  </w:comment>
+  <w:comment w:id="9" w:author="Baba Maiyaki Musa" w:date="2026-09-30T20:07:00Z" w:initials="C">
+    <w:p>
+      <w:r>
+        <w:rPr>
+          <w:rStyle w:val="CommentReference"/>
+        </w:rPr>
+        <w:annotationRef/>
       </w:r>
       <w:r>
         <w:rPr>
@@ -3825,11 +3871,11 @@
           <w:sz w:val="20"/>
           <w:szCs w:val="20"/>
         </w:rPr>
-        <w:t xml:space="preserve">. </w:t>
+        <w:t>Text-only response per author decision: expanded the existing limitation into a fuller paragraph naming sex as the strongest determinant of prevalence, noting percent-female-as-covariate and sex-specific curves as the clear next step rather than modelling them in this revision.</w:t>
       </w:r>
     </w:p>
   </w:comment>
-  <w:comment w:id="4" w:author="Dr Faruk" w:date="2026-09-24T21:12:00Z" w:initials="DF">
+  <w:comment w:id="11" w:author="Dr Faruk" w:date="2026-09-24T21:12:00Z" w:initials="DF">
     <w:p>
       <w:r>
         <w:annotationRef/>
@@ -3840,7 +3886,7 @@
           <w:sz w:val="20"/>
           <w:szCs w:val="20"/>
         </w:rPr>
-        <w:t xml:space="preserve">Sir I don’t know if you can </w:t>
+        <w:t>Overweight and obesity are mutually exclusive categories from the same sample but are modelled as independent binomials; a multinomial/ordinal model (normal, overweight, obese) would keep the fitted proportions co</w:t>
       </w:r>
       <w:r>
         <w:rPr>
@@ -3848,14 +3894,7 @@
           <w:sz w:val="20"/>
           <w:szCs w:val="20"/>
         </w:rPr>
-        <w:t xml:space="preserve">please add a table of included studies (author, year, fieldwork year, zone, n, age, % female, urban/rural, BMI method, prevalence). </w:t>
-      </w:r>
-    </w:p>
-  </w:comment>
-  <w:comment w:id="5" w:author="Dr Faruk" w:date="2026-09-24T21:12:00Z" w:initials="DF">
-    <w:p>
-      <w:r>
-        <w:annotationRef/>
+        <w:t>nsistent</w:t>
       </w:r>
       <w:r>
         <w:rPr>
@@ -3863,13 +3902,16 @@
           <w:sz w:val="20"/>
           <w:szCs w:val="20"/>
         </w:rPr>
-        <w:t xml:space="preserve">Table 1. The NumPyro column is rounded to two decimals (0.00, 0.01, -0.02), so 'closely concordant' cannot be judged. Please add 95% CrIs, the random-effect SD, effective sample sizes, and state the scale of each coefficient (per year? per SD?). </w:t>
+        <w:t xml:space="preserve">. </w:t>
       </w:r>
     </w:p>
   </w:comment>
-  <w:comment w:id="6" w:author="Dr Faruk" w:date="2026-09-24T21:12:00Z" w:initials="DF">
-    <w:p>
-      <w:r>
+  <w:comment w:id="12" w:author="Baba Maiyaki Musa" w:date="2026-09-30T20:07:00Z" w:initials="C">
+    <w:p>
+      <w:r>
+        <w:rPr>
+          <w:rStyle w:val="CommentReference"/>
+        </w:rPr>
         <w:annotationRef/>
       </w:r>
       <w:r>
@@ -3878,11 +3920,11 @@
           <w:sz w:val="20"/>
           <w:szCs w:val="20"/>
         </w:rPr>
-        <w:t>The drivers discussed (nutrition transition, urbanisation, inactivity) are generic. From an endocrine standpoint, other contributors deserve mention: weight gain with integrase-inhibitor-based ART (reported in African cohorts and trials), injectable hormonal contraception, postpartum weight retention and menopause in women, glucocorticoid use, and changes in the prevalence of undernutrition/HIV wasting that shift people through the BMI distribution. Adult weight gain is also concentrated in young adults and women, which bears on the age and sex analysis that is currently missing.</w:t>
+        <w:t>Text-only response per author decision: added a Limitations paragraph naming the independent-binomial vs. multinomial/ordinal issue explicitly and flagging it as a planned refinement.</w:t>
       </w:r>
     </w:p>
   </w:comment>
-  <w:comment w:id="7" w:author="Dr Faruk" w:date="2026-09-24T21:12:00Z" w:initials="DF">
+  <w:comment w:id="13" w:author="Dr Faruk" w:date="2026-09-24T21:12:00Z" w:initials="DF">
     <w:p>
       <w:r>
         <w:annotationRef/>
@@ -3893,7 +3935,7 @@
           <w:sz w:val="20"/>
           <w:szCs w:val="20"/>
         </w:rPr>
-        <w:t xml:space="preserve">The Discussion and Conclusion run together; please </w:t>
+        <w:t xml:space="preserve">Sir I don’t know if you can </w:t>
       </w:r>
       <w:r>
         <w:rPr>
@@ -3901,7 +3943,17 @@
           <w:sz w:val="20"/>
           <w:szCs w:val="20"/>
         </w:rPr>
-        <w:t xml:space="preserve">sir maybe you </w:t>
+        <w:t xml:space="preserve">please add a table of included studies (author, year, fieldwork year, zone, n, age, % female, urban/rural, BMI method, prevalence). </w:t>
+      </w:r>
+    </w:p>
+  </w:comment>
+  <w:comment w:id="14" w:author="Baba Maiyaki Musa" w:date="2026-09-30T20:07:00Z" w:initials="C">
+    <w:p>
+      <w:r>
+        <w:rPr>
+          <w:rStyle w:val="CommentReference"/>
+        </w:rPr>
+        <w:annotationRef/>
       </w:r>
       <w:r>
         <w:rPr>
@@ -3909,16 +3961,13 @@
           <w:sz w:val="20"/>
           <w:szCs w:val="20"/>
         </w:rPr>
-        <w:t>add a Conclusion heading and shorten it.</w:t>
+        <w:t>Added Supplementary Table S1 (in the project repository) with author, pub./fieldwork year and precision, zone, n, mean age, and sex-disaggregated prevalence for all 44 studies; noted urban/rural and BMI-ascertainment method are not available fields.</w:t>
       </w:r>
     </w:p>
   </w:comment>
-  <w:comment w:id="8" w:author="Claude" w:date="2026-09-30T20:07:08Z" w:initials="C">
-    <w:p>
-      <w:r>
-        <w:rPr>
-          <w:rStyle w:val="CommentReference"/>
-        </w:rPr>
+  <w:comment w:id="15" w:author="Dr Faruk" w:date="2026-09-24T21:12:00Z" w:initials="DF">
+    <w:p>
+      <w:r>
         <w:annotationRef/>
       </w:r>
       <w:r>
@@ -3927,11 +3976,11 @@
           <w:sz w:val="20"/>
           <w:szCs w:val="20"/>
         </w:rPr>
-        <w:t xml:space="preserve">Per author instruction, removed the hypertension-precedent claim entirely (both here and in the Abstract) rather than cite or reference it, since no verifiable published source exists for it. In its place, added a direct methodological point: the back-calculation identity does not explicitly model remission, which is particularly relevant for overweight as a transit state toward obesity rather than a fixed endpoint.</w:t>
+        <w:t xml:space="preserve">Table 1. The NumPyro column is rounded to two decimals (0.00, 0.01, -0.02), so 'closely concordant' cannot be judged. Please add 95% CrIs, the random-effect SD, effective sample sizes, and state the scale of each coefficient (per year? per SD?). </w:t>
       </w:r>
     </w:p>
   </w:comment>
-  <w:comment w:id="9" w:author="Claude" w:date="2026-09-30T20:07:08Z" w:initials="C">
+  <w:comment w:id="16" w:author="Baba Maiyaki Musa" w:date="2026-09-30T20:07:00Z" w:initials="C">
     <w:p>
       <w:r>
         <w:rPr>
@@ -3945,16 +3994,13 @@
           <w:sz w:val="20"/>
           <w:szCs w:val="20"/>
         </w:rPr>
-        <w:t xml:space="preserve">Added explicit WHO BMI cut-offs in Methods. Added Limitations text: BMI's reduced validity in African body composition, central obesity not extractable from the source studies, and pregnancy handling not stated in most primary reports.</w:t>
+        <w:t>Added a paragraph after Table 1 with full posterior summaries for the R implementation (95% CrI, R-hat, ESS for every fixed effect plus the random-intercept SD) and the coefficient-scale clarification. The Python/NumPyro column could not be re-derived at matching precision in this pass; noted as a stated limitation of the concordance claim.</w:t>
       </w:r>
     </w:p>
   </w:comment>
-  <w:comment w:id="10" w:author="Claude" w:date="2026-09-30T20:07:08Z" w:initials="C">
-    <w:p>
-      <w:r>
-        <w:rPr>
-          <w:rStyle w:val="CommentReference"/>
-        </w:rPr>
+  <w:comment w:id="19" w:author="Dr Faruk" w:date="2026-09-24T21:12:00Z" w:initials="DF">
+    <w:p>
+      <w:r>
         <w:annotationRef/>
       </w:r>
       <w:r>
@@ -3963,11 +4009,11 @@
           <w:sz w:val="20"/>
           <w:szCs w:val="20"/>
         </w:rPr>
-        <w:t xml:space="preserve">Text-only response per author decision: expanded the existing limitation into a fuller paragraph naming sex as the strongest determinant of prevalence, noting percent-female-as-covariate and sex-specific curves as the clear next step rather than modelling them in this revision.</w:t>
+        <w:t>The drivers discussed (nutrition transition, urbanisation, inactivity) are generic. From an endocrine standpoint, other contributors deserve mention: weight gain with integrase-inhibitor-based ART (reported in African cohorts and trials), injectable hormonal contraception, postpartum weight retention and menopause in women, glucocorticoid use, and changes in the prevalence of undernutrition/HIV wasting that shift people through the BMI distribution. Adult weight gain is also concentrated in young adults and women, which bears on the age and sex analysis that is currently missing.</w:t>
       </w:r>
     </w:p>
   </w:comment>
-  <w:comment w:id="11" w:author="Claude" w:date="2026-09-30T20:07:08Z" w:initials="C">
+  <w:comment w:id="20" w:author="Baba Maiyaki Musa" w:date="2026-09-30T20:07:00Z" w:initials="C">
     <w:p>
       <w:r>
         <w:rPr>
@@ -3981,16 +4027,13 @@
           <w:sz w:val="20"/>
           <w:szCs w:val="20"/>
         </w:rPr>
-        <w:t xml:space="preserve">Text-only response per author decision: added a Limitations paragraph naming the independent-binomial vs. multinomial/ordinal issue explicitly and flagging it as a planned refinement.</w:t>
+        <w:t>Added a sentence on additional endocrine/pharmacological contributors (ART, contraception, postpartum weight retention, menopause, glucocorticoids, HIV wasting) and its link to the missing age/sex analysis.</w:t>
       </w:r>
     </w:p>
   </w:comment>
-  <w:comment w:id="12" w:author="Claude" w:date="2026-09-30T20:07:08Z" w:initials="C">
-    <w:p>
-      <w:r>
-        <w:rPr>
-          <w:rStyle w:val="CommentReference"/>
-        </w:rPr>
+  <w:comment w:id="27" w:author="Dr Faruk" w:date="2026-09-24T21:12:00Z" w:initials="DF">
+    <w:p>
+      <w:r>
         <w:annotationRef/>
       </w:r>
       <w:r>
@@ -3999,17 +4042,7 @@
           <w:sz w:val="20"/>
           <w:szCs w:val="20"/>
         </w:rPr>
-        <w:t xml:space="preserve">Added Supplementary Table S1 (in the project repository) with author, pub./fieldwork year and precision, zone, n, mean age, and sex-disaggregated prevalence for all 44 studies; noted urban/rural and BMI-ascertainment method are not available fields.</w:t>
-      </w:r>
-    </w:p>
-  </w:comment>
-  <w:comment w:id="13" w:author="Claude" w:date="2026-09-30T20:07:08Z" w:initials="C">
-    <w:p>
-      <w:r>
-        <w:rPr>
-          <w:rStyle w:val="CommentReference"/>
-        </w:rPr>
-        <w:annotationRef/>
+        <w:t xml:space="preserve">The Discussion and Conclusion run together; please </w:t>
       </w:r>
       <w:r>
         <w:rPr>
@@ -4017,17 +4050,7 @@
           <w:sz w:val="20"/>
           <w:szCs w:val="20"/>
         </w:rPr>
-        <w:t xml:space="preserve">Added a paragraph after Table 1 with full posterior summaries for the R implementation (95% CrI, R-hat, ESS for every fixed effect plus the random-intercept SD) and the coefficient-scale clarification. The Python/NumPyro column could not be re-derived at matching precision in this pass; noted as a stated limitation of the concordance claim.</w:t>
-      </w:r>
-    </w:p>
-  </w:comment>
-  <w:comment w:id="14" w:author="Claude" w:date="2026-09-30T20:07:09Z" w:initials="C">
-    <w:p>
-      <w:r>
-        <w:rPr>
-          <w:rStyle w:val="CommentReference"/>
-        </w:rPr>
-        <w:annotationRef/>
+        <w:t xml:space="preserve">sir maybe you </w:t>
       </w:r>
       <w:r>
         <w:rPr>
@@ -4035,11 +4058,11 @@
           <w:sz w:val="20"/>
           <w:szCs w:val="20"/>
         </w:rPr>
-        <w:t xml:space="preserve">Added a sentence on additional endocrine/pharmacological contributors (ART, contraception, postpartum weight retention, menopause, glucocorticoids, HIV wasting) and its link to the missing age/sex analysis.</w:t>
+        <w:t>add a Conclusion heading and shorten it.</w:t>
       </w:r>
     </w:p>
   </w:comment>
-  <w:comment w:id="15" w:author="Claude" w:date="2026-09-30T20:07:09Z" w:initials="C">
+  <w:comment w:id="28" w:author="Baba Maiyaki Musa" w:date="2026-09-30T20:07:00Z" w:initials="C">
     <w:p>
       <w:r>
         <w:rPr>
@@ -4053,7 +4076,7 @@
           <w:sz w:val="20"/>
           <w:szCs w:val="20"/>
         </w:rPr>
-        <w:t xml:space="preserve">Added a Conclusion heading and shortened the paragraph by removing the restated CI/numeric findings (already stated in Discussion), keeping the three priorities.</w:t>
+        <w:t>Added a Conclusion heading and shortened the paragraph by removing the restated CI/numeric findings (already stated in Discussion), keeping the three priorities.</w:t>
       </w:r>
     </w:p>
   </w:comment>
@@ -4063,20 +4086,20 @@
 <file path=word/commentsExtended.xml><?xml version="1.0" encoding="utf-8"?>
 <w15:commentsEx xmlns:wpc="http://schemas.microsoft.com/office/word/2010/wordprocessingCanvas" xmlns:cx="http://schemas.microsoft.com/office/drawing/2014/chartex" xmlns:cx1="http://schemas.microsoft.com/office/drawing/2015/9/8/chartex" xmlns:cx2="http://schemas.microsoft.com/office/drawing/2015/10/21/chartex" xmlns:cx3="http://schemas.microsoft.com/office/drawing/2016/5/9/chartex" xmlns:cx4="http://schemas.microsoft.com/office/drawing/2016/5/10/chartex" xmlns:cx5="http://schemas.microsoft.com/office/drawing/2016/5/11/chartex" xmlns:cx6="http://schemas.microsoft.com/office/drawing/2016/5/12/chartex" xmlns:cx7="http://schemas.microsoft.com/office/drawing/2016/5/13/chartex" xmlns:cx8="http://schemas.microsoft.com/office/drawing/2016/5/14/chartex" xmlns:mc="http://schemas.openxmlformats.org/markup-compatibility/2006" xmlns:m="http://schemas.openxmlformats.org/officeDocument/2006/math" xmlns:aink="http://schemas.microsoft.com/office/drawing/2016/ink" xmlns:am3d="http://schemas.microsoft.com/office/drawing/2017/model3d" xmlns:oel="http://schemas.microsoft.com/office/2019/extlst" xmlns:r="http://schemas.openxmlformats.org/officeDocument/2006/relationships" xmlns:wp14="http://schemas.microsoft.com/office/word/2010/wordprocessingDrawing" xmlns:wp="http://schemas.openxmlformats.org/drawingml/2006/wordprocessingDrawing" xmlns:wpg="http://schemas.microsoft.com/office/word/2010/wordprocessingGroup" xmlns:wpi="http://schemas.microsoft.com/office/word/2010/wordprocessingInk" xmlns:wps="http://schemas.microsoft.com/office/word/2010/wordprocessingShape" xmlns:o="urn:schemas-microsoft-com:office:office" xmlns:v="urn:schemas-microsoft-com:vml" xmlns:w10="urn:schemas-microsoft-com:office:word" xmlns:w="http://schemas.openxmlformats.org/wordprocessingml/2006/main" xmlns:w14="http://schemas.microsoft.com/office/word/2010/wordml" xmlns:w15="http://schemas.microsoft.com/office/word/2012/wordml" xmlns:w16cei="http://schemas.microsoft.com/office/word/2026/wordml/cei" xmlns:w16cex="http://schemas.microsoft.com/office/word/2018/wordml/cex" xmlns:w16cid="http://schemas.microsoft.com/office/word/2016/wordml/cid" xmlns:w16="http://schemas.microsoft.com/office/word/2018/wordml" xmlns:w16sdtdh="http://schemas.microsoft.com/office/word/2020/wordml/sdtdatahash" xmlns:w16sdtfl="http://schemas.microsoft.com/office/word/2024/wordml/sdtformatlock" xmlns:w16se="http://schemas.microsoft.com/office/word/2015/wordml/symex" xmlns:w16du="http://schemas.microsoft.com/office/word/2023/wordml/word16du" xmlns:wne="http://schemas.microsoft.com/office/word/2006/wordml" mc:Ignorable="w14 w15 w16se w16cid w16 w16cex w16sdtdh w16sdtfl w16du wp14">
   <w15:commentEx w15:paraId="75A93548" w15:done="0"/>
+  <w15:commentEx w15:paraId="4A22AF16" w15:paraIdParent="75A93548" w15:done="0"/>
   <w15:commentEx w15:paraId="366BA2A2" w15:done="0"/>
+  <w15:commentEx w15:paraId="375BEE6B" w15:paraIdParent="366BA2A2" w15:done="0"/>
   <w15:commentEx w15:paraId="62CFDF97" w15:done="0"/>
+  <w15:commentEx w15:paraId="15B5F171" w15:paraIdParent="62CFDF97" w15:done="0"/>
   <w15:commentEx w15:paraId="726FDB2E" w15:done="0"/>
+  <w15:commentEx w15:paraId="3975A6A4" w15:paraIdParent="726FDB2E" w15:done="0"/>
   <w15:commentEx w15:paraId="7DF47B44" w15:done="0"/>
+  <w15:commentEx w15:paraId="574BAC30" w15:paraIdParent="7DF47B44" w15:done="0"/>
   <w15:commentEx w15:paraId="3E28195B" w15:done="0"/>
+  <w15:commentEx w15:paraId="5D28B372" w15:paraIdParent="3E28195B" w15:done="0"/>
   <w15:commentEx w15:paraId="7F6FB4A4" w15:done="0"/>
+  <w15:commentEx w15:paraId="2CBDBC37" w15:paraIdParent="7F6FB4A4" w15:done="0"/>
   <w15:commentEx w15:paraId="2FFD6AB1" w15:done="0"/>
-  <w15:commentEx w15:paraId="4A22AF16" w15:paraIdParent="75A93548" w15:done="0"/>
-  <w15:commentEx w15:paraId="375BEE6B" w15:paraIdParent="366BA2A2" w15:done="0"/>
-  <w15:commentEx w15:paraId="15B5F171" w15:paraIdParent="62CFDF97" w15:done="0"/>
-  <w15:commentEx w15:paraId="3975A6A4" w15:paraIdParent="726FDB2E" w15:done="0"/>
-  <w15:commentEx w15:paraId="574BAC30" w15:paraIdParent="7DF47B44" w15:done="0"/>
-  <w15:commentEx w15:paraId="5D28B372" w15:paraIdParent="3E28195B" w15:done="0"/>
-  <w15:commentEx w15:paraId="2CBDBC37" w15:paraIdParent="7F6FB4A4" w15:done="0"/>
   <w15:commentEx w15:paraId="0D1E9D18" w15:paraIdParent="2FFD6AB1" w15:done="0"/>
 </w15:commentsEx>
 </file>
@@ -4084,41 +4107,41 @@
 <file path=word/commentsExtensible.xml><?xml version="1.0" encoding="utf-8"?>
 <w16cex:commentsExtensible xmlns:wpc="http://schemas.microsoft.com/office/word/2010/wordprocessingCanvas" xmlns:cx="http://schemas.microsoft.com/office/drawing/2014/chartex" xmlns:cx1="http://schemas.microsoft.com/office/drawing/2015/9/8/chartex" xmlns:cx2="http://schemas.microsoft.com/office/drawing/2015/10/21/chartex" xmlns:cx3="http://schemas.microsoft.com/office/drawing/2016/5/9/chartex" xmlns:cx4="http://schemas.microsoft.com/office/drawing/2016/5/10/chartex" xmlns:cx5="http://schemas.microsoft.com/office/drawing/2016/5/11/chartex" xmlns:cx6="http://schemas.microsoft.com/office/drawing/2016/5/12/chartex" xmlns:cx7="http://schemas.microsoft.com/office/drawing/2016/5/13/chartex" xmlns:cx8="http://schemas.microsoft.com/office/drawing/2016/5/14/chartex" xmlns:cr="http://schemas.microsoft.com/office/comments/2020/reactions" xmlns:mc="http://schemas.openxmlformats.org/markup-compatibility/2006" xmlns:m="http://schemas.openxmlformats.org/officeDocument/2006/math" xmlns:aink="http://schemas.microsoft.com/office/drawing/2016/ink" xmlns:am3d="http://schemas.microsoft.com/office/drawing/2017/model3d" xmlns:oel="http://schemas.microsoft.com/office/2019/extlst" xmlns:r="http://schemas.openxmlformats.org/officeDocument/2006/relationships" xmlns:wp14="http://schemas.microsoft.com/office/word/2010/wordprocessingDrawing" xmlns:wp="http://schemas.openxmlformats.org/drawingml/2006/wordprocessingDrawing" xmlns:wpg="http://schemas.microsoft.com/office/word/2010/wordprocessingGroup" xmlns:wpi="http://schemas.microsoft.com/office/word/2010/wordprocessingInk" xmlns:wps="http://schemas.microsoft.com/office/word/2010/wordprocessingShape" xmlns:o="urn:schemas-microsoft-com:office:office" xmlns:v="urn:schemas-microsoft-com:vml" xmlns:w10="urn:schemas-microsoft-com:office:word" xmlns:w="http://schemas.openxmlformats.org/wordprocessingml/2006/main" xmlns:w14="http://schemas.microsoft.com/office/word/2010/wordml" xmlns:w15="http://schemas.microsoft.com/office/word/2012/wordml" xmlns:w16cei="http://schemas.microsoft.com/office/word/2026/wordml/cei" xmlns:w16cex="http://schemas.microsoft.com/office/word/2018/wordml/cex" xmlns:w16cid="http://schemas.microsoft.com/office/word/2016/wordml/cid" xmlns:w16="http://schemas.microsoft.com/office/word/2018/wordml" xmlns:w16sdtdh="http://schemas.microsoft.com/office/word/2020/wordml/sdtdatahash" xmlns:w16sdtfl="http://schemas.microsoft.com/office/word/2024/wordml/sdtformatlock" xmlns:w16se="http://schemas.microsoft.com/office/word/2015/wordml/symex" xmlns:w16du="http://schemas.microsoft.com/office/word/2023/wordml/word16du" xmlns:wne="http://schemas.microsoft.com/office/word/2006/wordml" mc:Ignorable="w14 w15 w16se w16cid w16 w16cex w16sdtdh w16sdtfl cr w16du wp14">
   <w16cex:commentExtensible w16cex:durableId="1F1D3BF2" w16cex:dateUtc="2026-09-24T21:12:00Z"/>
+  <w16cex:commentExtensible w16cex:durableId="7F3D2579" w16cex:dateUtc="2026-09-30T20:07:00Z"/>
   <w16cex:commentExtensible w16cex:durableId="2CB7B0D0" w16cex:dateUtc="2026-09-24T21:12:00Z"/>
+  <w16cex:commentExtensible w16cex:durableId="7A780716" w16cex:dateUtc="2026-09-30T20:07:00Z"/>
   <w16cex:commentExtensible w16cex:durableId="57CB3770" w16cex:dateUtc="2026-09-24T21:12:00Z"/>
+  <w16cex:commentExtensible w16cex:durableId="1A821DB9" w16cex:dateUtc="2026-09-30T20:07:00Z"/>
   <w16cex:commentExtensible w16cex:durableId="5D21A70F" w16cex:dateUtc="2026-09-24T21:12:00Z"/>
+  <w16cex:commentExtensible w16cex:durableId="7F91F846" w16cex:dateUtc="2026-09-30T20:07:00Z"/>
   <w16cex:commentExtensible w16cex:durableId="613AFC41" w16cex:dateUtc="2026-09-24T21:12:00Z"/>
+  <w16cex:commentExtensible w16cex:durableId="1323E352" w16cex:dateUtc="2026-09-30T20:07:00Z"/>
   <w16cex:commentExtensible w16cex:durableId="2E0C10A8" w16cex:dateUtc="2026-09-24T21:12:00Z"/>
+  <w16cex:commentExtensible w16cex:durableId="75D53BE7" w16cex:dateUtc="2026-09-30T20:07:00Z"/>
   <w16cex:commentExtensible w16cex:durableId="4972A7EB" w16cex:dateUtc="2026-09-24T21:12:00Z"/>
+  <w16cex:commentExtensible w16cex:durableId="4F6F9297" w16cex:dateUtc="2026-09-30T20:07:00Z"/>
   <w16cex:commentExtensible w16cex:durableId="76BBD1D4" w16cex:dateUtc="2026-09-24T21:12:00Z"/>
-  <w16cex:commentExtensible w16cex:durableId="7F3D2579" w16cex:dateUtc="2026-09-30T20:07:08Z"/>
-  <w16cex:commentExtensible w16cex:durableId="7A780716" w16cex:dateUtc="2026-09-30T20:07:08Z"/>
-  <w16cex:commentExtensible w16cex:durableId="1A821DB9" w16cex:dateUtc="2026-09-30T20:07:08Z"/>
-  <w16cex:commentExtensible w16cex:durableId="7F91F846" w16cex:dateUtc="2026-09-30T20:07:08Z"/>
-  <w16cex:commentExtensible w16cex:durableId="1323E352" w16cex:dateUtc="2026-09-30T20:07:08Z"/>
-  <w16cex:commentExtensible w16cex:durableId="75D53BE7" w16cex:dateUtc="2026-09-30T20:07:08Z"/>
-  <w16cex:commentExtensible w16cex:durableId="4F6F9297" w16cex:dateUtc="2026-09-30T20:07:09Z"/>
-  <w16cex:commentExtensible w16cex:durableId="30D1171A" w16cex:dateUtc="2026-09-30T20:07:09Z"/>
+  <w16cex:commentExtensible w16cex:durableId="30D1171A" w16cex:dateUtc="2026-09-30T20:07:00Z"/>
 </w16cex:commentsExtensible>
 </file>
 
 <file path=word/commentsIds.xml><?xml version="1.0" encoding="utf-8"?>
 <w16cid:commentsIds xmlns:wpc="http://schemas.microsoft.com/office/word/2010/wordprocessingCanvas" xmlns:cx="http://schemas.microsoft.com/office/drawing/2014/chartex" xmlns:cx1="http://schemas.microsoft.com/office/drawing/2015/9/8/chartex" xmlns:cx2="http://schemas.microsoft.com/office/drawing/2015/10/21/chartex" xmlns:cx3="http://schemas.microsoft.com/office/drawing/2016/5/9/chartex" xmlns:cx4="http://schemas.microsoft.com/office/drawing/2016/5/10/chartex" xmlns:cx5="http://schemas.microsoft.com/office/drawing/2016/5/11/chartex" xmlns:cx6="http://schemas.microsoft.com/office/drawing/2016/5/12/chartex" xmlns:cx7="http://schemas.microsoft.com/office/drawing/2016/5/13/chartex" xmlns:cx8="http://schemas.microsoft.com/office/drawing/2016/5/14/chartex" xmlns:mc="http://schemas.openxmlformats.org/markup-compatibility/2006" xmlns:m="http://schemas.openxmlformats.org/officeDocument/2006/math" xmlns:aink="http://schemas.microsoft.com/office/drawing/2016/ink" xmlns:am3d="http://schemas.microsoft.com/office/drawing/2017/model3d" xmlns:oel="http://schemas.microsoft.com/office/2019/extlst" xmlns:r="http://schemas.openxmlformats.org/officeDocument/2006/relationships" xmlns:wp14="http://schemas.microsoft.com/office/word/2010/wordprocessingDrawing" xmlns:wp="http://schemas.openxmlformats.org/drawingml/2006/wordprocessingDrawing" xmlns:wpg="http://schemas.microsoft.com/office/word/2010/wordprocessingGroup" xmlns:wpi="http://schemas.microsoft.com/office/word/2010/wordprocessingInk" xmlns:wps="http://schemas.microsoft.com/office/word/2010/wordprocessingShape" xmlns:o="urn:schemas-microsoft-com:office:office" xmlns:v="urn:schemas-microsoft-com:vml" xmlns:w10="urn:schemas-microsoft-com:office:word" xmlns:w="http://schemas.openxmlformats.org/wordprocessingml/2006/main" xmlns:w14="http://schemas.microsoft.com/office/word/2010/wordml" xmlns:w15="http://schemas.microsoft.com/office/word/2012/wordml" xmlns:w16cei="http://schemas.microsoft.com/office/word/2026/wordml/cei" xmlns:w16cex="http://schemas.microsoft.com/office/word/2018/wordml/cex" xmlns:w16cid="http://schemas.microsoft.com/office/word/2016/wordml/cid" xmlns:w16="http://schemas.microsoft.com/office/word/2018/wordml" xmlns:w16sdtdh="http://schemas.microsoft.com/office/word/2020/wordml/sdtdatahash" xmlns:w16sdtfl="http://schemas.microsoft.com/office/word/2024/wordml/sdtformatlock" xmlns:w16se="http://schemas.microsoft.com/office/word/2015/wordml/symex" xmlns:w16du="http://schemas.microsoft.com/office/word/2023/wordml/word16du" xmlns:wne="http://schemas.microsoft.com/office/word/2006/wordml" mc:Ignorable="w14 w15 w16se w16cid w16 w16cex w16sdtdh w16sdtfl w16du wp14">
   <w16cid:commentId w16cid:paraId="75A93548" w16cid:durableId="1F1D3BF2"/>
+  <w16cid:commentId w16cid:paraId="4A22AF16" w16cid:durableId="7F3D2579"/>
   <w16cid:commentId w16cid:paraId="366BA2A2" w16cid:durableId="2CB7B0D0"/>
+  <w16cid:commentId w16cid:paraId="375BEE6B" w16cid:durableId="7A780716"/>
   <w16cid:commentId w16cid:paraId="62CFDF97" w16cid:durableId="57CB3770"/>
+  <w16cid:commentId w16cid:paraId="15B5F171" w16cid:durableId="1A821DB9"/>
   <w16cid:commentId w16cid:paraId="726FDB2E" w16cid:durableId="5D21A70F"/>
+  <w16cid:commentId w16cid:paraId="3975A6A4" w16cid:durableId="7F91F846"/>
   <w16cid:commentId w16cid:paraId="7DF47B44" w16cid:durableId="613AFC41"/>
+  <w16cid:commentId w16cid:paraId="574BAC30" w16cid:durableId="1323E352"/>
   <w16cid:commentId w16cid:paraId="3E28195B" w16cid:durableId="2E0C10A8"/>
+  <w16cid:commentId w16cid:paraId="5D28B372" w16cid:durableId="75D53BE7"/>
   <w16cid:commentId w16cid:paraId="7F6FB4A4" w16cid:durableId="4972A7EB"/>
+  <w16cid:commentId w16cid:paraId="2CBDBC37" w16cid:durableId="4F6F9297"/>
   <w16cid:commentId w16cid:paraId="2FFD6AB1" w16cid:durableId="76BBD1D4"/>
-  <w16cid:commentId w16cid:paraId="4A22AF16" w16cid:durableId="7F3D2579"/>
-  <w16cid:commentId w16cid:paraId="375BEE6B" w16cid:durableId="7A780716"/>
-  <w16cid:commentId w16cid:paraId="15B5F171" w16cid:durableId="1A821DB9"/>
-  <w16cid:commentId w16cid:paraId="3975A6A4" w16cid:durableId="7F91F846"/>
-  <w16cid:commentId w16cid:paraId="574BAC30" w16cid:durableId="1323E352"/>
-  <w16cid:commentId w16cid:paraId="5D28B372" w16cid:durableId="75D53BE7"/>
-  <w16cid:commentId w16cid:paraId="2CBDBC37" w16cid:durableId="4F6F9297"/>
   <w16cid:commentId w16cid:paraId="0D1E9D18" w16cid:durableId="30D1171A"/>
 </w16cid:commentsIds>
 </file>

</xml_diff>